<commit_message>
feat: Add Data Protection Impact Assessment templates and enhance schema handling in development mode
</commit_message>
<xml_diff>
--- a/models/dpia/references/Data Protection Impact Assessment Screening Questions.docx
+++ b/models/dpia/references/Data Protection Impact Assessment Screening Questions.docx
@@ -1,6 +1,6 @@
 
 <file path=word/document.xml><?xml version="1.0" encoding="utf-8"?>
-<w:document xmlns:wpc="http://schemas.microsoft.com/office/word/2010/wordprocessingCanvas" xmlns:cx="http://schemas.microsoft.com/office/drawing/2014/chartex" xmlns:mc="http://schemas.openxmlformats.org/markup-compatibility/2006" xmlns:o="urn:schemas-microsoft-com:office:office" xmlns:r="http://schemas.openxmlformats.org/officeDocument/2006/relationships" xmlns:m="http://schemas.openxmlformats.org/officeDocument/2006/math" xmlns:v="urn:schemas-microsoft-com:vml" xmlns:wp14="http://schemas.microsoft.com/office/word/2010/wordprocessingDrawing" xmlns:wp="http://schemas.openxmlformats.org/drawingml/2006/wordprocessingDrawing" xmlns:w10="urn:schemas-microsoft-com:office:word" xmlns:w="http://schemas.openxmlformats.org/wordprocessingml/2006/main" xmlns:w14="http://schemas.microsoft.com/office/word/2010/wordml" xmlns:w15="http://schemas.microsoft.com/office/word/2012/wordml" xmlns:w16se="http://schemas.microsoft.com/office/word/2015/wordml/symex" xmlns:wpg="http://schemas.microsoft.com/office/word/2010/wordprocessingGroup" xmlns:wpi="http://schemas.microsoft.com/office/word/2010/wordprocessingInk" xmlns:wne="http://schemas.microsoft.com/office/word/2006/wordml" xmlns:wps="http://schemas.microsoft.com/office/word/2010/wordprocessingShape" mc:Ignorable="w14 w15 w16se wp14">
+<w:document xmlns:wpc="http://schemas.microsoft.com/office/word/2010/wordprocessingCanvas" xmlns:cx="http://schemas.microsoft.com/office/drawing/2014/chartex" xmlns:cx1="http://schemas.microsoft.com/office/drawing/2015/9/8/chartex" xmlns:cx2="http://schemas.microsoft.com/office/drawing/2015/10/21/chartex" xmlns:cx3="http://schemas.microsoft.com/office/drawing/2016/5/9/chartex" xmlns:cx4="http://schemas.microsoft.com/office/drawing/2016/5/10/chartex" xmlns:cx5="http://schemas.microsoft.com/office/drawing/2016/5/11/chartex" xmlns:cx6="http://schemas.microsoft.com/office/drawing/2016/5/12/chartex" xmlns:cx7="http://schemas.microsoft.com/office/drawing/2016/5/13/chartex" xmlns:cx8="http://schemas.microsoft.com/office/drawing/2016/5/14/chartex" xmlns:mc="http://schemas.openxmlformats.org/markup-compatibility/2006" xmlns:aink="http://schemas.microsoft.com/office/drawing/2016/ink" xmlns:am3d="http://schemas.microsoft.com/office/drawing/2017/model3d" xmlns:o="urn:schemas-microsoft-com:office:office" xmlns:oel="http://schemas.microsoft.com/office/2019/extlst" xmlns:r="http://schemas.openxmlformats.org/officeDocument/2006/relationships" xmlns:m="http://schemas.openxmlformats.org/officeDocument/2006/math" xmlns:v="urn:schemas-microsoft-com:vml" xmlns:wp14="http://schemas.microsoft.com/office/word/2010/wordprocessingDrawing" xmlns:wp="http://schemas.openxmlformats.org/drawingml/2006/wordprocessingDrawing" xmlns:w10="urn:schemas-microsoft-com:office:word" xmlns:w="http://schemas.openxmlformats.org/wordprocessingml/2006/main" xmlns:w14="http://schemas.microsoft.com/office/word/2010/wordml" xmlns:w15="http://schemas.microsoft.com/office/word/2012/wordml" xmlns:w16cex="http://schemas.microsoft.com/office/word/2018/wordml/cex" xmlns:w16cid="http://schemas.microsoft.com/office/word/2016/wordml/cid" xmlns:w16="http://schemas.microsoft.com/office/word/2018/wordml" xmlns:w16du="http://schemas.microsoft.com/office/word/2023/wordml/word16du" xmlns:w16sdtdh="http://schemas.microsoft.com/office/word/2020/wordml/sdtdatahash" xmlns:w16sdtfl="http://schemas.microsoft.com/office/word/2024/wordml/sdtformatlock" xmlns:w16se="http://schemas.microsoft.com/office/word/2015/wordml/symex" xmlns:wpg="http://schemas.microsoft.com/office/word/2010/wordprocessingGroup" xmlns:wpi="http://schemas.microsoft.com/office/word/2010/wordprocessingInk" xmlns:wne="http://schemas.microsoft.com/office/word/2006/wordml" xmlns:wps="http://schemas.microsoft.com/office/word/2010/wordprocessingShape" mc:Ignorable="w14 w15 w16se w16cid w16 w16cex w16sdtdh w16sdtfl w16du wp14">
   <w:body>
     <w:p>
       <w:pPr>
@@ -31,55 +31,29 @@
       <w:pPr>
         <w:rPr>
           <w:shd w:val="clear" w:color="auto" w:fill="FFFFFF"/>
-          <w:lang w:val="en-GB"/>
         </w:rPr>
       </w:pPr>
       <w:r>
         <w:rPr>
           <w:shd w:val="clear" w:color="auto" w:fill="FFFFFF"/>
-          <w:lang w:val="en-GB"/>
         </w:rPr>
         <w:t>Use t</w:t>
       </w:r>
       <w:r>
         <w:rPr>
           <w:shd w:val="clear" w:color="auto" w:fill="FFFFFF"/>
-          <w:lang w:val="en-GB"/>
-        </w:rPr>
-        <w:t xml:space="preserve">his form to </w:t>
+        </w:rPr>
+        <w:t>his form to determine if you need to complete a full DPIA</w:t>
       </w:r>
       <w:r>
         <w:rPr>
           <w:shd w:val="clear" w:color="auto" w:fill="FFFFFF"/>
-          <w:lang w:val="en-GB"/>
-        </w:rPr>
-        <w:t>determine</w:t>
+        </w:rPr>
+        <w:t xml:space="preserve">.  It </w:t>
       </w:r>
       <w:r>
         <w:rPr>
           <w:shd w:val="clear" w:color="auto" w:fill="FFFFFF"/>
-          <w:lang w:val="en-GB"/>
-        </w:rPr>
-        <w:t xml:space="preserve"> if you need to complete a full DPIA</w:t>
-      </w:r>
-      <w:r>
-        <w:rPr>
-          <w:shd w:val="clear" w:color="auto" w:fill="FFFFFF"/>
-          <w:lang w:val="en-GB"/>
-        </w:rPr>
-        <w:t xml:space="preserve">.  </w:t>
-      </w:r>
-      <w:r>
-        <w:rPr>
-          <w:shd w:val="clear" w:color="auto" w:fill="FFFFFF"/>
-          <w:lang w:val="en-GB"/>
-        </w:rPr>
-        <w:t xml:space="preserve">It </w:t>
-      </w:r>
-      <w:r>
-        <w:rPr>
-          <w:shd w:val="clear" w:color="auto" w:fill="FFFFFF"/>
-          <w:lang w:val="en-GB"/>
         </w:rPr>
         <w:t>should be used:</w:t>
       </w:r>
@@ -161,8 +135,6 @@
         <w:tc>
           <w:tcPr>
             <w:tcW w:w="3652" w:type="dxa"/>
-            <w:shd w:val="clear" w:color="auto" w:fill="auto"/>
-            <w:tcMar/>
           </w:tcPr>
           <w:p>
             <w:pPr>
@@ -184,13 +156,11 @@
         <w:tc>
           <w:tcPr>
             <w:tcW w:w="6372" w:type="dxa"/>
-            <w:tcMar/>
           </w:tcPr>
           <w:p>
             <w:pPr>
               <w:rPr>
                 <w:sz w:val="22"/>
-                <w:szCs w:val="22"/>
                 <w:shd w:val="clear" w:color="auto" w:fill="FFFFFF"/>
               </w:rPr>
             </w:pPr>
@@ -201,8 +171,6 @@
         <w:tc>
           <w:tcPr>
             <w:tcW w:w="3652" w:type="dxa"/>
-            <w:shd w:val="clear" w:color="auto" w:fill="auto"/>
-            <w:tcMar/>
           </w:tcPr>
           <w:p>
             <w:pPr>
@@ -233,13 +201,11 @@
         <w:tc>
           <w:tcPr>
             <w:tcW w:w="6372" w:type="dxa"/>
-            <w:tcMar/>
           </w:tcPr>
           <w:p>
             <w:pPr>
               <w:rPr>
                 <w:sz w:val="22"/>
-                <w:szCs w:val="22"/>
                 <w:shd w:val="clear" w:color="auto" w:fill="FFFFFF"/>
               </w:rPr>
             </w:pPr>
@@ -250,50 +216,42 @@
         <w:tc>
           <w:tcPr>
             <w:tcW w:w="3652" w:type="dxa"/>
-            <w:shd w:val="clear" w:color="auto" w:fill="auto"/>
-            <w:tcMar/>
-          </w:tcPr>
-          <w:p>
-            <w:pPr>
-              <w:rPr>
-                <w:b w:val="1"/>
-                <w:bCs w:val="1"/>
+          </w:tcPr>
+          <w:p>
+            <w:pPr>
+              <w:rPr>
+                <w:b/>
+                <w:bCs/>
                 <w:sz w:val="22"/>
-                <w:szCs w:val="22"/>
                 <w:shd w:val="clear" w:color="auto" w:fill="FFFFFF"/>
-                <w:lang w:val="en-GB"/>
-              </w:rPr>
-            </w:pPr>
-            <w:r>
-              <w:rPr>
-                <w:b w:val="1"/>
-                <w:bCs w:val="1"/>
+              </w:rPr>
+            </w:pPr>
+            <w:r>
+              <w:rPr>
+                <w:b/>
+                <w:bCs/>
                 <w:sz w:val="22"/>
-                <w:szCs w:val="22"/>
                 <w:shd w:val="clear" w:color="auto" w:fill="FFFFFF"/>
-                <w:lang w:val="en-GB"/>
               </w:rPr>
               <w:t>Department/Faculty/</w:t>
             </w:r>
-            <w:r>
-              <w:rPr>
-                <w:b w:val="1"/>
-                <w:bCs w:val="1"/>
+            <w:proofErr w:type="gramStart"/>
+            <w:r>
+              <w:rPr>
+                <w:b/>
+                <w:bCs/>
                 <w:sz w:val="22"/>
-                <w:szCs w:val="22"/>
                 <w:shd w:val="clear" w:color="auto" w:fill="FFFFFF"/>
-                <w:lang w:val="en-GB"/>
               </w:rPr>
               <w:t>Professional  Service</w:t>
             </w:r>
-            <w:r>
-              <w:rPr>
-                <w:b w:val="1"/>
-                <w:bCs w:val="1"/>
+            <w:proofErr w:type="gramEnd"/>
+            <w:r>
+              <w:rPr>
+                <w:b/>
+                <w:bCs/>
                 <w:sz w:val="22"/>
-                <w:szCs w:val="22"/>
                 <w:shd w:val="clear" w:color="auto" w:fill="FFFFFF"/>
-                <w:lang w:val="en-GB"/>
               </w:rPr>
               <w:t xml:space="preserve"> area</w:t>
             </w:r>
@@ -302,13 +260,11 @@
         <w:tc>
           <w:tcPr>
             <w:tcW w:w="6372" w:type="dxa"/>
-            <w:tcMar/>
           </w:tcPr>
           <w:p>
             <w:pPr>
               <w:rPr>
                 <w:sz w:val="22"/>
-                <w:szCs w:val="22"/>
                 <w:shd w:val="clear" w:color="auto" w:fill="FFFFFF"/>
               </w:rPr>
             </w:pPr>
@@ -319,8 +275,6 @@
         <w:tc>
           <w:tcPr>
             <w:tcW w:w="3652" w:type="dxa"/>
-            <w:shd w:val="clear" w:color="auto" w:fill="auto"/>
-            <w:tcMar/>
           </w:tcPr>
           <w:p>
             <w:pPr>
@@ -343,13 +297,11 @@
         <w:tc>
           <w:tcPr>
             <w:tcW w:w="6372" w:type="dxa"/>
-            <w:tcMar/>
           </w:tcPr>
           <w:p>
             <w:pPr>
               <w:rPr>
                 <w:sz w:val="22"/>
-                <w:szCs w:val="22"/>
                 <w:shd w:val="clear" w:color="auto" w:fill="FFFFFF"/>
               </w:rPr>
             </w:pPr>
@@ -360,8 +312,6 @@
         <w:tc>
           <w:tcPr>
             <w:tcW w:w="3652" w:type="dxa"/>
-            <w:shd w:val="clear" w:color="auto" w:fill="auto"/>
-            <w:tcMar/>
           </w:tcPr>
           <w:p>
             <w:pPr>
@@ -384,13 +334,11 @@
         <w:tc>
           <w:tcPr>
             <w:tcW w:w="6372" w:type="dxa"/>
-            <w:tcMar/>
           </w:tcPr>
           <w:p>
             <w:pPr>
               <w:rPr>
                 <w:sz w:val="22"/>
-                <w:szCs w:val="22"/>
                 <w:shd w:val="clear" w:color="auto" w:fill="FFFFFF"/>
               </w:rPr>
             </w:pPr>
@@ -410,125 +358,38 @@
     <w:p>
       <w:pPr>
         <w:rPr>
-          <w:b w:val="1"/>
-          <w:bCs w:val="1"/>
-          <w:shd w:val="clear" w:color="auto" w:fill="FFFFFF"/>
-          <w:lang w:val="en-GB"/>
+          <w:b/>
+          <w:bCs/>
+          <w:shd w:val="clear" w:color="auto" w:fill="FFFFFF"/>
         </w:rPr>
       </w:pPr>
       <w:r>
         <w:rPr>
-          <w:b w:val="1"/>
-          <w:bCs w:val="1"/>
-          <w:shd w:val="clear" w:color="auto" w:fill="FFFFFF"/>
-          <w:lang w:val="en-GB"/>
-        </w:rPr>
-        <w:t xml:space="preserve">Note re </w:t>
-      </w:r>
-      <w:r>
-        <w:rPr>
-          <w:b w:val="1"/>
-          <w:bCs w:val="1"/>
-          <w:shd w:val="clear" w:color="auto" w:fill="FFFFFF"/>
-          <w:lang w:val="en-GB"/>
-        </w:rPr>
-        <w:t>purchasing</w:t>
-      </w:r>
-      <w:r>
-        <w:rPr>
-          <w:b w:val="1"/>
-          <w:bCs w:val="1"/>
-          <w:shd w:val="clear" w:color="auto" w:fill="FFFFFF"/>
-          <w:lang w:val="en-GB"/>
-        </w:rPr>
-        <w:t>/procuring goods/services:</w:t>
+          <w:b/>
+          <w:bCs/>
+          <w:shd w:val="clear" w:color="auto" w:fill="FFFFFF"/>
+        </w:rPr>
+        <w:t>Note re purchasing/procuring goods/services:</w:t>
       </w:r>
     </w:p>
     <w:p>
       <w:pPr>
         <w:rPr>
           <w:sz w:val="22"/>
-          <w:szCs w:val="22"/>
-          <w:shd w:val="clear" w:color="auto" w:fill="FFFFFF"/>
-          <w:lang w:val="en-GB"/>
+          <w:shd w:val="clear" w:color="auto" w:fill="FFFFFF"/>
         </w:rPr>
       </w:pPr>
       <w:r>
         <w:rPr>
           <w:shd w:val="clear" w:color="auto" w:fill="FFFFFF"/>
-          <w:lang w:val="en-GB"/>
-        </w:rPr>
-        <w:t>I</w:t>
+        </w:rPr>
+        <w:t xml:space="preserve">Irrespective of the value of the contract or which University-approved purchasing route you follow, it is important to determine whether personal data will be involved in the goods/services being procured.  See </w:t>
       </w:r>
-      <w:r>
-        <w:rPr>
-          <w:shd w:val="clear" w:color="auto" w:fill="FFFFFF"/>
-          <w:lang w:val="en-GB"/>
-        </w:rPr>
-        <w:t xml:space="preserve">rrespective of the value of the contract or which University-approved </w:t>
-      </w:r>
-      <w:r>
-        <w:rPr>
-          <w:shd w:val="clear" w:color="auto" w:fill="FFFFFF"/>
-          <w:lang w:val="en-GB"/>
-        </w:rPr>
-        <w:t xml:space="preserve">purchasing</w:t>
-      </w:r>
-      <w:r>
-        <w:rPr>
-          <w:shd w:val="clear" w:color="auto" w:fill="FFFFFF"/>
-          <w:lang w:val="en-GB"/>
-        </w:rPr>
-        <w:t xml:space="preserve"> route you </w:t>
-      </w:r>
-      <w:r>
-        <w:rPr>
-          <w:shd w:val="clear" w:color="auto" w:fill="FFFFFF"/>
-          <w:lang w:val="en-GB"/>
-        </w:rPr>
-        <w:t xml:space="preserve">follow,</w:t>
-      </w:r>
-      <w:r>
-        <w:rPr>
-          <w:shd w:val="clear" w:color="auto" w:fill="FFFFFF"/>
-          <w:lang w:val="en-GB"/>
-        </w:rPr>
-        <w:t xml:space="preserve"> it is important to </w:t>
-      </w:r>
-      <w:r>
-        <w:rPr>
-          <w:shd w:val="clear" w:color="auto" w:fill="FFFFFF"/>
-          <w:lang w:val="en-GB"/>
-        </w:rPr>
-        <w:t xml:space="preserve">determine</w:t>
-      </w:r>
-      <w:r>
-        <w:rPr>
-          <w:shd w:val="clear" w:color="auto" w:fill="FFFFFF"/>
-          <w:lang w:val="en-GB"/>
-        </w:rPr>
-        <w:t xml:space="preserve"> whether personal data will be involved in the goods/services being procured</w:t>
-      </w:r>
-      <w:r>
-        <w:rPr>
-          <w:shd w:val="clear" w:color="auto" w:fill="FFFFFF"/>
-          <w:lang w:val="en-GB"/>
-        </w:rPr>
-        <w:t xml:space="preserve">.  </w:t>
-      </w:r>
-      <w:r>
-        <w:rPr>
-          <w:shd w:val="clear" w:color="auto" w:fill="FFFFFF"/>
-          <w:lang w:val="en-GB"/>
-        </w:rPr>
-        <w:t xml:space="preserve">See </w:t>
-      </w:r>
-      <w:hyperlink w:history="1" r:id="Recbc803fec004dc6">
+      <w:hyperlink r:id="rId11" w:history="1">
         <w:r>
           <w:rPr>
             <w:rStyle w:val="Hyperlink"/>
             <w:shd w:val="clear" w:color="auto" w:fill="FFFFFF"/>
-            <w:lang w:val="en-GB"/>
           </w:rPr>
           <w:t>University Procurement guidance</w:t>
         </w:r>
@@ -536,16 +397,8 @@
       <w:r>
         <w:rPr>
           <w:shd w:val="clear" w:color="auto" w:fill="FFFFFF"/>
-          <w:lang w:val="en-GB"/>
-        </w:rPr>
-        <w:t xml:space="preserve"> for further information about the various procurement routes</w:t>
-      </w:r>
-      <w:r>
-        <w:rPr>
-          <w:shd w:val="clear" w:color="auto" w:fill="FFFFFF"/>
-          <w:lang w:val="en-GB"/>
-        </w:rPr>
-        <w:t xml:space="preserve">.  </w:t>
+        </w:rPr>
+        <w:t xml:space="preserve"> for further information about the various procurement routes.  </w:t>
       </w:r>
     </w:p>
     <w:p>
@@ -598,12 +451,12 @@
         <w:tblW w:w="10029" w:type="dxa"/>
         <w:tblInd w:w="-5" w:type="dxa"/>
         <w:tblBorders>
-          <w:top w:val="single" w:color="auto" w:sz="4" w:space="0"/>
-          <w:left w:val="single" w:color="auto" w:sz="4" w:space="0"/>
-          <w:bottom w:val="single" w:color="auto" w:sz="4" w:space="0"/>
-          <w:right w:val="single" w:color="auto" w:sz="4" w:space="0"/>
-          <w:insideH w:val="single" w:color="auto" w:sz="4" w:space="0"/>
-          <w:insideV w:val="single" w:color="auto" w:sz="4" w:space="0"/>
+          <w:top w:val="single" w:sz="4" w:space="0" w:color="auto"/>
+          <w:left w:val="single" w:sz="4" w:space="0" w:color="auto"/>
+          <w:bottom w:val="single" w:sz="4" w:space="0" w:color="auto"/>
+          <w:right w:val="single" w:sz="4" w:space="0" w:color="auto"/>
+          <w:insideH w:val="single" w:sz="4" w:space="0" w:color="auto"/>
+          <w:insideV w:val="single" w:sz="4" w:space="0" w:color="auto"/>
         </w:tblBorders>
         <w:tblLook w:val="04A0" w:firstRow="1" w:lastRow="0" w:firstColumn="1" w:lastColumn="0" w:noHBand="0" w:noVBand="1"/>
       </w:tblPr>
@@ -621,7 +474,6 @@
         <w:tc>
           <w:tcPr>
             <w:tcW w:w="993" w:type="dxa"/>
-            <w:tcMar/>
           </w:tcPr>
           <w:p>
             <w:pPr>
@@ -632,8 +484,6 @@
         <w:tc>
           <w:tcPr>
             <w:tcW w:w="7815" w:type="dxa"/>
-            <w:shd w:val="clear" w:color="auto" w:fill="auto"/>
-            <w:tcMar/>
           </w:tcPr>
           <w:p>
             <w:pPr>
@@ -645,7 +495,6 @@
           <w:tcPr>
             <w:tcW w:w="721" w:type="dxa"/>
             <w:shd w:val="clear" w:color="auto" w:fill="D9D9D9" w:themeFill="background1" w:themeFillShade="D9"/>
-            <w:tcMar/>
           </w:tcPr>
           <w:p>
             <w:pPr>
@@ -666,7 +515,6 @@
           <w:tcPr>
             <w:tcW w:w="500" w:type="dxa"/>
             <w:shd w:val="clear" w:color="auto" w:fill="D9D9D9" w:themeFill="background1" w:themeFillShade="D9"/>
-            <w:tcMar/>
           </w:tcPr>
           <w:p>
             <w:pPr>
@@ -688,7 +536,6 @@
         <w:tc>
           <w:tcPr>
             <w:tcW w:w="993" w:type="dxa"/>
-            <w:tcMar/>
           </w:tcPr>
           <w:p>
             <w:pPr>
@@ -707,8 +554,6 @@
         <w:tc>
           <w:tcPr>
             <w:tcW w:w="7815" w:type="dxa"/>
-            <w:shd w:val="clear" w:color="auto" w:fill="auto"/>
-            <w:tcMar/>
           </w:tcPr>
           <w:p>
             <w:pPr>
@@ -735,7 +580,7 @@
               </w:rPr>
               <w:t xml:space="preserve"> involve processing </w:t>
             </w:r>
-            <w:hyperlink w:history="1" r:id="rId13">
+            <w:hyperlink r:id="rId12" w:history="1">
               <w:r>
                 <w:rPr>
                   <w:rStyle w:val="Hyperlink"/>
@@ -754,95 +599,30 @@
           <w:p>
             <w:pPr>
               <w:rPr>
-                <w:b w:val="1"/>
-                <w:bCs w:val="1"/>
-                <w:lang w:val="en-GB"/>
-              </w:rPr>
-            </w:pPr>
-            <w:r>
-              <w:rPr>
-                <w:b w:val="1"/>
-                <w:bCs w:val="1"/>
-                <w:lang w:val="en-GB"/>
-              </w:rPr>
-              <w:t xml:space="preserve">This definition can include IP address, cookies or other facts that could directly or indirectly </w:t>
-            </w:r>
-            <w:r>
-              <w:rPr>
-                <w:b w:val="1"/>
-                <w:bCs w:val="1"/>
-                <w:lang w:val="en-GB"/>
-              </w:rPr>
-              <w:t>identify</w:t>
-            </w:r>
-            <w:r>
-              <w:rPr>
-                <w:b w:val="1"/>
-                <w:bCs w:val="1"/>
-                <w:lang w:val="en-GB"/>
-              </w:rPr>
-              <w:t xml:space="preserve"> an individual</w:t>
-            </w:r>
-            <w:r>
-              <w:rPr>
-                <w:b w:val="1"/>
-                <w:bCs w:val="1"/>
-                <w:lang w:val="en-GB"/>
-              </w:rPr>
-              <w:t xml:space="preserve">.  </w:t>
-            </w:r>
-          </w:p>
-          <w:p>
-            <w:r>
-              <w:rPr>
-                <w:i w:val="1"/>
-                <w:iCs w:val="1"/>
-                <w:lang w:val="en-GB"/>
-              </w:rPr>
-              <w:t>NB for procurement/</w:t>
-            </w:r>
-            <w:r>
-              <w:rPr>
-                <w:i w:val="1"/>
-                <w:iCs w:val="1"/>
-                <w:lang w:val="en-GB"/>
-              </w:rPr>
-              <w:t>purchasing</w:t>
-            </w:r>
-            <w:r>
-              <w:rPr>
-                <w:i w:val="1"/>
-                <w:iCs w:val="1"/>
-                <w:lang w:val="en-GB"/>
-              </w:rPr>
-              <w:t xml:space="preserve"> exercises this relates to the goods/services being </w:t>
-            </w:r>
-            <w:r>
-              <w:rPr>
-                <w:i w:val="1"/>
-                <w:iCs w:val="1"/>
-                <w:lang w:val="en-GB"/>
-              </w:rPr>
-              <w:t>purchased</w:t>
-            </w:r>
-            <w:r>
-              <w:rPr>
-                <w:i w:val="1"/>
-                <w:iCs w:val="1"/>
-                <w:lang w:val="en-GB"/>
-              </w:rPr>
-              <w:t>, not any information shared as part of the tender process, e.g. CVs/contact details from tendering organisations etc</w:t>
-            </w:r>
-            <w:r>
-              <w:rPr>
-                <w:lang w:val="en-GB"/>
-              </w:rPr>
+                <w:b/>
+                <w:bCs/>
+              </w:rPr>
+            </w:pPr>
+            <w:r>
+              <w:rPr>
+                <w:b/>
+                <w:bCs/>
+              </w:rPr>
+              <w:t xml:space="preserve">This definition can include IP address, cookies or other facts that could directly or indirectly identify an individual.  </w:t>
+            </w:r>
+          </w:p>
+          <w:p>
+            <w:r>
+              <w:rPr>
+                <w:i/>
+                <w:iCs/>
+              </w:rPr>
+              <w:t>NB for procurement/purchasing exercises this relates to the goods/services being purchased, not any information shared as part of the tender process, e.g. CVs/contact details from tendering organisations etc</w:t>
+            </w:r>
+            <w:r>
               <w:t>.</w:t>
             </w:r>
             <w:r>
-              <w:rPr>
-                <w:lang w:val="en-GB"/>
-              </w:rPr>
               <w:t xml:space="preserve"> </w:t>
             </w:r>
           </w:p>
@@ -850,8 +630,6 @@
         <w:tc>
           <w:tcPr>
             <w:tcW w:w="721" w:type="dxa"/>
-            <w:shd w:val="clear" w:color="auto" w:fill="auto"/>
-            <w:tcMar/>
           </w:tcPr>
           <w:p>
             <w:pPr>
@@ -862,8 +640,6 @@
         <w:tc>
           <w:tcPr>
             <w:tcW w:w="500" w:type="dxa"/>
-            <w:shd w:val="clear" w:color="auto" w:fill="auto"/>
-            <w:tcMar/>
           </w:tcPr>
           <w:p>
             <w:pPr>
@@ -960,7 +736,7 @@
         </w:rPr>
         <w:t xml:space="preserve"> </w:t>
       </w:r>
-      <w:hyperlink w:history="1" r:id="rId14">
+      <w:hyperlink r:id="rId13" w:history="1">
         <w:r>
           <w:rPr>
             <w:rStyle w:val="Hyperlink"/>
@@ -1030,12 +806,12 @@
         <w:tblW w:w="10029" w:type="dxa"/>
         <w:tblInd w:w="-5" w:type="dxa"/>
         <w:tblBorders>
-          <w:top w:val="single" w:color="auto" w:sz="4" w:space="0"/>
-          <w:left w:val="single" w:color="auto" w:sz="4" w:space="0"/>
-          <w:bottom w:val="single" w:color="auto" w:sz="4" w:space="0"/>
-          <w:right w:val="single" w:color="auto" w:sz="4" w:space="0"/>
-          <w:insideH w:val="single" w:color="auto" w:sz="4" w:space="0"/>
-          <w:insideV w:val="single" w:color="auto" w:sz="4" w:space="0"/>
+          <w:top w:val="single" w:sz="4" w:space="0" w:color="auto"/>
+          <w:left w:val="single" w:sz="4" w:space="0" w:color="auto"/>
+          <w:bottom w:val="single" w:sz="4" w:space="0" w:color="auto"/>
+          <w:right w:val="single" w:sz="4" w:space="0" w:color="auto"/>
+          <w:insideH w:val="single" w:sz="4" w:space="0" w:color="auto"/>
+          <w:insideV w:val="single" w:sz="4" w:space="0" w:color="auto"/>
         </w:tblBorders>
         <w:tblLook w:val="04A0" w:firstRow="1" w:lastRow="0" w:firstColumn="1" w:lastColumn="0" w:noHBand="0" w:noVBand="1"/>
       </w:tblPr>
@@ -1053,7 +829,6 @@
         <w:tc>
           <w:tcPr>
             <w:tcW w:w="851" w:type="dxa"/>
-            <w:tcMar/>
           </w:tcPr>
           <w:p>
             <w:pPr>
@@ -1064,8 +839,6 @@
         <w:tc>
           <w:tcPr>
             <w:tcW w:w="7965" w:type="dxa"/>
-            <w:shd w:val="clear" w:color="auto" w:fill="auto"/>
-            <w:tcMar/>
           </w:tcPr>
           <w:p>
             <w:pPr>
@@ -1077,7 +850,6 @@
           <w:tcPr>
             <w:tcW w:w="585" w:type="dxa"/>
             <w:shd w:val="clear" w:color="auto" w:fill="D9D9D9" w:themeFill="background1" w:themeFillShade="D9"/>
-            <w:tcMar/>
           </w:tcPr>
           <w:p>
             <w:pPr>
@@ -1098,7 +870,6 @@
           <w:tcPr>
             <w:tcW w:w="628" w:type="dxa"/>
             <w:shd w:val="clear" w:color="auto" w:fill="D9D9D9" w:themeFill="background1" w:themeFillShade="D9"/>
-            <w:tcMar/>
           </w:tcPr>
           <w:p>
             <w:pPr>
@@ -1120,7 +891,6 @@
         <w:tc>
           <w:tcPr>
             <w:tcW w:w="851" w:type="dxa"/>
-            <w:tcMar/>
           </w:tcPr>
           <w:p>
             <w:pPr>
@@ -1140,56 +910,28 @@
         <w:tc>
           <w:tcPr>
             <w:tcW w:w="7965" w:type="dxa"/>
-            <w:shd w:val="clear" w:color="auto" w:fill="auto"/>
-            <w:tcMar/>
-          </w:tcPr>
-          <w:p>
-            <w:pPr>
-              <w:jc w:val="both"/>
-            </w:pPr>
-            <w:r>
-              <w:rPr>
-                <w:lang w:val="en-GB"/>
-              </w:rPr>
+          </w:tcPr>
+          <w:p>
+            <w:pPr>
+              <w:jc w:val="both"/>
+            </w:pPr>
+            <w:r>
               <w:t>Will the project compel</w:t>
             </w:r>
             <w:r>
-              <w:rPr>
-                <w:lang w:val="en-GB"/>
-              </w:rPr>
               <w:t>/require</w:t>
             </w:r>
             <w:r>
-              <w:rPr>
-                <w:lang w:val="en-GB"/>
-              </w:rPr>
               <w:t xml:space="preserve"> individuals to provide information about themselves</w:t>
             </w:r>
             <w:r>
-              <w:rPr>
-                <w:lang w:val="en-GB"/>
-              </w:rPr>
-              <w:t xml:space="preserve">, i.e. they have no real </w:t>
-            </w:r>
-            <w:r>
-              <w:rPr>
-                <w:lang w:val="en-GB"/>
-              </w:rPr>
-              <w:t>option</w:t>
-            </w:r>
-            <w:r>
-              <w:rPr>
-                <w:lang w:val="en-GB"/>
-              </w:rPr>
-              <w:t xml:space="preserve"> other than to provide information? </w:t>
+              <w:t xml:space="preserve">, i.e. they have no real option other than to provide information? </w:t>
             </w:r>
           </w:p>
         </w:tc>
         <w:tc>
           <w:tcPr>
             <w:tcW w:w="585" w:type="dxa"/>
-            <w:shd w:val="clear" w:color="auto" w:fill="auto"/>
-            <w:tcMar/>
           </w:tcPr>
           <w:p>
             <w:pPr>
@@ -1200,8 +942,6 @@
         <w:tc>
           <w:tcPr>
             <w:tcW w:w="628" w:type="dxa"/>
-            <w:shd w:val="clear" w:color="auto" w:fill="auto"/>
-            <w:tcMar/>
           </w:tcPr>
           <w:p>
             <w:pPr>
@@ -1214,7 +954,6 @@
         <w:tc>
           <w:tcPr>
             <w:tcW w:w="851" w:type="dxa"/>
-            <w:tcMar/>
           </w:tcPr>
           <w:p>
             <w:pPr>
@@ -1234,35 +973,15 @@
         <w:tc>
           <w:tcPr>
             <w:tcW w:w="7965" w:type="dxa"/>
-            <w:shd w:val="clear" w:color="auto" w:fill="auto"/>
-            <w:tcMar/>
-          </w:tcPr>
-          <w:p>
-            <w:pPr>
-              <w:jc w:val="both"/>
-            </w:pPr>
-            <w:r>
-              <w:rPr>
-                <w:lang w:val="en-GB"/>
-              </w:rPr>
-              <w:t xml:space="preserve">Will information about individuals be </w:t>
-            </w:r>
-            <w:r>
-              <w:rPr>
-                <w:lang w:val="en-GB"/>
-              </w:rPr>
-              <w:t>disclosed</w:t>
-            </w:r>
-            <w:r>
-              <w:rPr>
-                <w:lang w:val="en-GB"/>
-              </w:rPr>
-              <w:t xml:space="preserve"> to organisations or people </w:t>
-            </w:r>
-            <w:r>
-              <w:rPr>
-                <w:lang w:val="en-GB"/>
-              </w:rPr>
+          </w:tcPr>
+          <w:p>
+            <w:pPr>
+              <w:jc w:val="both"/>
+            </w:pPr>
+            <w:r>
+              <w:t xml:space="preserve">Will information about individuals be disclosed to organisations or people </w:t>
+            </w:r>
+            <w:r>
               <w:t xml:space="preserve">external to the University? </w:t>
             </w:r>
           </w:p>
@@ -1284,8 +1003,6 @@
         <w:tc>
           <w:tcPr>
             <w:tcW w:w="585" w:type="dxa"/>
-            <w:shd w:val="clear" w:color="auto" w:fill="auto"/>
-            <w:tcMar/>
           </w:tcPr>
           <w:p>
             <w:pPr>
@@ -1296,8 +1013,6 @@
         <w:tc>
           <w:tcPr>
             <w:tcW w:w="628" w:type="dxa"/>
-            <w:shd w:val="clear" w:color="auto" w:fill="auto"/>
-            <w:tcMar/>
           </w:tcPr>
           <w:p>
             <w:pPr>
@@ -1310,7 +1025,6 @@
         <w:tc>
           <w:tcPr>
             <w:tcW w:w="851" w:type="dxa"/>
-            <w:tcMar/>
           </w:tcPr>
           <w:p>
             <w:pPr>
@@ -1330,8 +1044,6 @@
         <w:tc>
           <w:tcPr>
             <w:tcW w:w="7965" w:type="dxa"/>
-            <w:shd w:val="clear" w:color="auto" w:fill="auto"/>
-            <w:tcMar/>
           </w:tcPr>
           <w:p>
             <w:pPr>
@@ -1364,21 +1076,14 @@
               <w:jc w:val="both"/>
             </w:pPr>
             <w:r>
-              <w:rPr>
-                <w:lang w:val="en-GB"/>
-              </w:rPr>
               <w:t xml:space="preserve">There is no definition of </w:t>
             </w:r>
-            <w:r>
-              <w:rPr>
-                <w:lang w:val="en-GB"/>
-              </w:rPr>
+            <w:proofErr w:type="gramStart"/>
+            <w:r>
               <w:t>large-scale</w:t>
             </w:r>
-            <w:r>
-              <w:rPr>
-                <w:lang w:val="en-GB"/>
-              </w:rPr>
+            <w:proofErr w:type="gramEnd"/>
+            <w:r>
               <w:t xml:space="preserve"> but you should consider:</w:t>
             </w:r>
           </w:p>
@@ -1398,8 +1103,16 @@
               <w:rPr>
                 <w:szCs w:val="20"/>
               </w:rPr>
-              <w:t>the number of individuals involved;</w:t>
-            </w:r>
+              <w:t xml:space="preserve">the number of individuals </w:t>
+            </w:r>
+            <w:proofErr w:type="gramStart"/>
+            <w:r>
+              <w:rPr>
+                <w:szCs w:val="20"/>
+              </w:rPr>
+              <w:t>involved;</w:t>
+            </w:r>
+            <w:proofErr w:type="gramEnd"/>
           </w:p>
           <w:p>
             <w:pPr>
@@ -1471,7 +1184,7 @@
               </w:rPr>
               <w:t xml:space="preserve">More information can be found on the </w:t>
             </w:r>
-            <w:hyperlink w:history="1" w:anchor="when12" r:id="rId15">
+            <w:hyperlink r:id="rId14" w:anchor="when12" w:history="1">
               <w:r>
                 <w:rPr>
                   <w:rStyle w:val="Hyperlink"/>
@@ -1497,8 +1210,6 @@
         <w:tc>
           <w:tcPr>
             <w:tcW w:w="585" w:type="dxa"/>
-            <w:shd w:val="clear" w:color="auto" w:fill="auto"/>
-            <w:tcMar/>
           </w:tcPr>
           <w:p>
             <w:pPr>
@@ -1509,8 +1220,6 @@
         <w:tc>
           <w:tcPr>
             <w:tcW w:w="628" w:type="dxa"/>
-            <w:shd w:val="clear" w:color="auto" w:fill="auto"/>
-            <w:tcMar/>
           </w:tcPr>
           <w:p>
             <w:pPr>
@@ -1523,7 +1232,6 @@
         <w:tc>
           <w:tcPr>
             <w:tcW w:w="851" w:type="dxa"/>
-            <w:tcMar/>
           </w:tcPr>
           <w:p>
             <w:pPr>
@@ -1543,8 +1251,6 @@
         <w:tc>
           <w:tcPr>
             <w:tcW w:w="7965" w:type="dxa"/>
-            <w:shd w:val="clear" w:color="auto" w:fill="auto"/>
-            <w:tcMar/>
           </w:tcPr>
           <w:p>
             <w:pPr>
@@ -1564,8 +1270,6 @@
         <w:tc>
           <w:tcPr>
             <w:tcW w:w="585" w:type="dxa"/>
-            <w:shd w:val="clear" w:color="auto" w:fill="auto"/>
-            <w:tcMar/>
           </w:tcPr>
           <w:p>
             <w:pPr>
@@ -1576,8 +1280,6 @@
         <w:tc>
           <w:tcPr>
             <w:tcW w:w="628" w:type="dxa"/>
-            <w:shd w:val="clear" w:color="auto" w:fill="auto"/>
-            <w:tcMar/>
           </w:tcPr>
           <w:p>
             <w:pPr>
@@ -1590,7 +1292,6 @@
         <w:tc>
           <w:tcPr>
             <w:tcW w:w="851" w:type="dxa"/>
-            <w:tcMar/>
           </w:tcPr>
           <w:p>
             <w:pPr>
@@ -1610,44 +1311,22 @@
         <w:tc>
           <w:tcPr>
             <w:tcW w:w="7965" w:type="dxa"/>
-            <w:shd w:val="clear" w:color="auto" w:fill="auto"/>
-            <w:tcMar/>
-          </w:tcPr>
-          <w:p>
-            <w:pPr>
-              <w:jc w:val="both"/>
-            </w:pPr>
-            <w:r>
-              <w:rPr>
-                <w:lang w:val="en-GB"/>
-              </w:rPr>
+          </w:tcPr>
+          <w:p>
+            <w:pPr>
+              <w:jc w:val="both"/>
+            </w:pPr>
+            <w:r>
               <w:t>Does the project i</w:t>
             </w:r>
             <w:r>
-              <w:rPr>
-                <w:lang w:val="en-GB"/>
-              </w:rPr>
-              <w:t xml:space="preserve">nvolve you using </w:t>
-            </w:r>
-            <w:r>
-              <w:rPr>
-                <w:lang w:val="en-GB"/>
-              </w:rPr>
-              <w:t>new technology</w:t>
-            </w:r>
-            <w:r>
-              <w:rPr>
-                <w:lang w:val="en-GB"/>
-              </w:rPr>
-              <w:t>?</w:t>
+              <w:t>nvolve you using new technology?</w:t>
             </w:r>
           </w:p>
         </w:tc>
         <w:tc>
           <w:tcPr>
             <w:tcW w:w="585" w:type="dxa"/>
-            <w:shd w:val="clear" w:color="auto" w:fill="auto"/>
-            <w:tcMar/>
           </w:tcPr>
           <w:p>
             <w:pPr>
@@ -1658,8 +1337,6 @@
         <w:tc>
           <w:tcPr>
             <w:tcW w:w="628" w:type="dxa"/>
-            <w:shd w:val="clear" w:color="auto" w:fill="auto"/>
-            <w:tcMar/>
           </w:tcPr>
           <w:p>
             <w:pPr>
@@ -1672,7 +1349,6 @@
         <w:tc>
           <w:tcPr>
             <w:tcW w:w="851" w:type="dxa"/>
-            <w:tcMar/>
           </w:tcPr>
           <w:p>
             <w:pPr>
@@ -1692,8 +1368,6 @@
         <w:tc>
           <w:tcPr>
             <w:tcW w:w="7965" w:type="dxa"/>
-            <w:shd w:val="clear" w:color="auto" w:fill="auto"/>
-            <w:tcMar/>
           </w:tcPr>
           <w:p>
             <w:pPr>
@@ -1713,8 +1387,6 @@
         <w:tc>
           <w:tcPr>
             <w:tcW w:w="585" w:type="dxa"/>
-            <w:shd w:val="clear" w:color="auto" w:fill="auto"/>
-            <w:tcMar/>
           </w:tcPr>
           <w:p>
             <w:pPr>
@@ -1725,8 +1397,6 @@
         <w:tc>
           <w:tcPr>
             <w:tcW w:w="628" w:type="dxa"/>
-            <w:shd w:val="clear" w:color="auto" w:fill="auto"/>
-            <w:tcMar/>
           </w:tcPr>
           <w:p>
             <w:pPr>
@@ -1739,7 +1409,6 @@
         <w:tc>
           <w:tcPr>
             <w:tcW w:w="851" w:type="dxa"/>
-            <w:tcMar/>
           </w:tcPr>
           <w:p>
             <w:pPr>
@@ -1759,29 +1428,20 @@
         <w:tc>
           <w:tcPr>
             <w:tcW w:w="7965" w:type="dxa"/>
-            <w:shd w:val="clear" w:color="auto" w:fill="auto"/>
-            <w:tcMar/>
-          </w:tcPr>
-          <w:p>
-            <w:pPr>
-              <w:jc w:val="both"/>
-            </w:pPr>
-            <w:r>
-              <w:rPr>
-                <w:lang w:val="en-GB"/>
-              </w:rPr>
+          </w:tcPr>
+          <w:p>
+            <w:pPr>
+              <w:jc w:val="both"/>
+            </w:pPr>
+            <w:r>
               <w:t xml:space="preserve">Will the project result in you making decisions or </w:t>
             </w:r>
-            <w:r>
-              <w:rPr>
-                <w:lang w:val="en-GB"/>
-              </w:rPr>
+            <w:proofErr w:type="gramStart"/>
+            <w:r>
               <w:t>taking action</w:t>
             </w:r>
-            <w:r>
-              <w:rPr>
-                <w:lang w:val="en-GB"/>
-              </w:rPr>
+            <w:proofErr w:type="gramEnd"/>
+            <w:r>
               <w:t xml:space="preserve"> against individuals in ways which can have a significant impact on them?</w:t>
             </w:r>
           </w:p>
@@ -1789,8 +1449,6 @@
         <w:tc>
           <w:tcPr>
             <w:tcW w:w="585" w:type="dxa"/>
-            <w:shd w:val="clear" w:color="auto" w:fill="auto"/>
-            <w:tcMar/>
           </w:tcPr>
           <w:p>
             <w:pPr>
@@ -1801,8 +1459,6 @@
         <w:tc>
           <w:tcPr>
             <w:tcW w:w="628" w:type="dxa"/>
-            <w:shd w:val="clear" w:color="auto" w:fill="auto"/>
-            <w:tcMar/>
           </w:tcPr>
           <w:p>
             <w:pPr>
@@ -1815,7 +1471,6 @@
         <w:tc>
           <w:tcPr>
             <w:tcW w:w="851" w:type="dxa"/>
-            <w:tcMar/>
           </w:tcPr>
           <w:p>
             <w:pPr>
@@ -1835,8 +1490,6 @@
         <w:tc>
           <w:tcPr>
             <w:tcW w:w="7965" w:type="dxa"/>
-            <w:shd w:val="clear" w:color="auto" w:fill="auto"/>
-            <w:tcMar/>
           </w:tcPr>
           <w:p>
             <w:pPr>
@@ -1892,7 +1545,21 @@
               <w:rPr>
                 <w:szCs w:val="20"/>
               </w:rPr>
-              <w:t xml:space="preserve">racial or ethnic origin; </w:t>
+              <w:t xml:space="preserve">racial or ethnic </w:t>
+            </w:r>
+            <w:proofErr w:type="gramStart"/>
+            <w:r>
+              <w:rPr>
+                <w:szCs w:val="20"/>
+              </w:rPr>
+              <w:t>origin;</w:t>
+            </w:r>
+            <w:proofErr w:type="gramEnd"/>
+            <w:r>
+              <w:rPr>
+                <w:szCs w:val="20"/>
+              </w:rPr>
+              <w:t xml:space="preserve"> </w:t>
             </w:r>
           </w:p>
           <w:p>
@@ -1911,8 +1578,16 @@
               <w:rPr>
                 <w:szCs w:val="20"/>
               </w:rPr>
-              <w:t>political opinions;</w:t>
-            </w:r>
+              <w:t xml:space="preserve">political </w:t>
+            </w:r>
+            <w:proofErr w:type="gramStart"/>
+            <w:r>
+              <w:rPr>
+                <w:szCs w:val="20"/>
+              </w:rPr>
+              <w:t>opinions;</w:t>
+            </w:r>
+            <w:proofErr w:type="gramEnd"/>
           </w:p>
           <w:p>
             <w:pPr>
@@ -1930,8 +1605,16 @@
               <w:rPr>
                 <w:szCs w:val="20"/>
               </w:rPr>
-              <w:t>religious beliefs or philosophical beliefs;</w:t>
-            </w:r>
+              <w:t xml:space="preserve">religious beliefs or philosophical </w:t>
+            </w:r>
+            <w:proofErr w:type="gramStart"/>
+            <w:r>
+              <w:rPr>
+                <w:szCs w:val="20"/>
+              </w:rPr>
+              <w:t>beliefs;</w:t>
+            </w:r>
+            <w:proofErr w:type="gramEnd"/>
           </w:p>
           <w:p>
             <w:pPr>
@@ -1949,8 +1632,16 @@
               <w:rPr>
                 <w:szCs w:val="20"/>
               </w:rPr>
-              <w:t>trade union membership;</w:t>
-            </w:r>
+              <w:t xml:space="preserve">trade union </w:t>
+            </w:r>
+            <w:proofErr w:type="gramStart"/>
+            <w:r>
+              <w:rPr>
+                <w:szCs w:val="20"/>
+              </w:rPr>
+              <w:t>membership;</w:t>
+            </w:r>
+            <w:proofErr w:type="gramEnd"/>
           </w:p>
           <w:p>
             <w:pPr>
@@ -1968,8 +1659,16 @@
               <w:rPr>
                 <w:szCs w:val="20"/>
               </w:rPr>
-              <w:t>genetic data;</w:t>
-            </w:r>
+              <w:t xml:space="preserve">genetic </w:t>
+            </w:r>
+            <w:proofErr w:type="gramStart"/>
+            <w:r>
+              <w:rPr>
+                <w:szCs w:val="20"/>
+              </w:rPr>
+              <w:t>data;</w:t>
+            </w:r>
+            <w:proofErr w:type="gramEnd"/>
           </w:p>
           <w:p>
             <w:pPr>
@@ -1979,26 +1678,15 @@
                 <w:numId w:val="9"/>
               </w:numPr>
               <w:spacing w:after="240"/>
-              <w:rPr/>
-            </w:pPr>
-            <w:r>
-              <w:rPr>
-                <w:lang w:val="en-GB"/>
-              </w:rPr>
-              <w:t xml:space="preserve">biometric data (to uniquely </w:t>
-            </w:r>
-            <w:r>
-              <w:rPr>
-                <w:lang w:val="en-GB"/>
-              </w:rPr>
-              <w:t>identify</w:t>
-            </w:r>
-            <w:r>
-              <w:rPr>
-                <w:lang w:val="en-GB"/>
-              </w:rPr>
-              <w:t xml:space="preserve"> an individual);</w:t>
-            </w:r>
+            </w:pPr>
+            <w:r>
+              <w:t>biometric data (to uniquely identify an individual</w:t>
+            </w:r>
+            <w:proofErr w:type="gramStart"/>
+            <w:r>
+              <w:t>);</w:t>
+            </w:r>
+            <w:proofErr w:type="gramEnd"/>
           </w:p>
           <w:p>
             <w:pPr>
@@ -2016,8 +1704,16 @@
               <w:rPr>
                 <w:szCs w:val="20"/>
               </w:rPr>
-              <w:t>health data;</w:t>
-            </w:r>
+              <w:t xml:space="preserve">health </w:t>
+            </w:r>
+            <w:proofErr w:type="gramStart"/>
+            <w:r>
+              <w:rPr>
+                <w:szCs w:val="20"/>
+              </w:rPr>
+              <w:t>data;</w:t>
+            </w:r>
+            <w:proofErr w:type="gramEnd"/>
           </w:p>
           <w:p>
             <w:pPr>
@@ -2079,8 +1775,6 @@
         <w:tc>
           <w:tcPr>
             <w:tcW w:w="585" w:type="dxa"/>
-            <w:shd w:val="clear" w:color="auto" w:fill="auto"/>
-            <w:tcMar/>
           </w:tcPr>
           <w:p>
             <w:pPr>
@@ -2091,8 +1785,6 @@
         <w:tc>
           <w:tcPr>
             <w:tcW w:w="628" w:type="dxa"/>
-            <w:shd w:val="clear" w:color="auto" w:fill="auto"/>
-            <w:tcMar/>
           </w:tcPr>
           <w:p>
             <w:pPr>
@@ -2105,7 +1797,6 @@
         <w:tc>
           <w:tcPr>
             <w:tcW w:w="851" w:type="dxa"/>
-            <w:tcMar/>
           </w:tcPr>
           <w:p>
             <w:pPr>
@@ -2125,8 +1816,6 @@
         <w:tc>
           <w:tcPr>
             <w:tcW w:w="7965" w:type="dxa"/>
-            <w:shd w:val="clear" w:color="auto" w:fill="auto"/>
-            <w:tcMar/>
           </w:tcPr>
           <w:p>
             <w:pPr>
@@ -2146,8 +1835,6 @@
         <w:tc>
           <w:tcPr>
             <w:tcW w:w="585" w:type="dxa"/>
-            <w:shd w:val="clear" w:color="auto" w:fill="auto"/>
-            <w:tcMar/>
           </w:tcPr>
           <w:p>
             <w:pPr>
@@ -2158,8 +1845,6 @@
         <w:tc>
           <w:tcPr>
             <w:tcW w:w="628" w:type="dxa"/>
-            <w:shd w:val="clear" w:color="auto" w:fill="auto"/>
-            <w:tcMar/>
           </w:tcPr>
           <w:p>
             <w:pPr>
@@ -2172,7 +1857,6 @@
         <w:tc>
           <w:tcPr>
             <w:tcW w:w="851" w:type="dxa"/>
-            <w:tcMar/>
           </w:tcPr>
           <w:p>
             <w:pPr>
@@ -2192,8 +1876,6 @@
         <w:tc>
           <w:tcPr>
             <w:tcW w:w="7965" w:type="dxa"/>
-            <w:shd w:val="clear" w:color="auto" w:fill="auto"/>
-            <w:tcMar/>
           </w:tcPr>
           <w:p>
             <w:pPr>
@@ -2213,8 +1895,6 @@
         <w:tc>
           <w:tcPr>
             <w:tcW w:w="585" w:type="dxa"/>
-            <w:shd w:val="clear" w:color="auto" w:fill="auto"/>
-            <w:tcMar/>
           </w:tcPr>
           <w:p>
             <w:pPr>
@@ -2225,8 +1905,6 @@
         <w:tc>
           <w:tcPr>
             <w:tcW w:w="628" w:type="dxa"/>
-            <w:shd w:val="clear" w:color="auto" w:fill="auto"/>
-            <w:tcMar/>
           </w:tcPr>
           <w:p>
             <w:pPr>
@@ -2239,7 +1917,6 @@
         <w:tc>
           <w:tcPr>
             <w:tcW w:w="851" w:type="dxa"/>
-            <w:tcMar/>
           </w:tcPr>
           <w:p>
             <w:pPr>
@@ -2259,43 +1936,23 @@
         <w:tc>
           <w:tcPr>
             <w:tcW w:w="7965" w:type="dxa"/>
-            <w:shd w:val="clear" w:color="auto" w:fill="auto"/>
-            <w:tcMar/>
-          </w:tcPr>
-          <w:p>
-            <w:pPr>
-              <w:jc w:val="both"/>
-              <w:rPr>
-                <w:b w:val="1"/>
-                <w:bCs w:val="1"/>
-                <w:lang w:val="en-GB"/>
-              </w:rPr>
-            </w:pPr>
-            <w:r>
-              <w:rPr>
-                <w:lang w:val="en-GB"/>
-              </w:rPr>
-              <w:t xml:space="preserve">Will the project systematically </w:t>
-            </w:r>
-            <w:r>
-              <w:rPr>
-                <w:lang w:val="en-GB"/>
-              </w:rPr>
-              <w:t>monitor</w:t>
-            </w:r>
-            <w:r>
-              <w:rPr>
-                <w:lang w:val="en-GB"/>
-              </w:rPr>
-              <w:t xml:space="preserve"> a publicly accessible place?</w:t>
+          </w:tcPr>
+          <w:p>
+            <w:pPr>
+              <w:jc w:val="both"/>
+              <w:rPr>
+                <w:b/>
+                <w:bCs/>
+              </w:rPr>
+            </w:pPr>
+            <w:r>
+              <w:t>Will the project systematically monitor a publicly accessible place?</w:t>
             </w:r>
           </w:p>
         </w:tc>
         <w:tc>
           <w:tcPr>
             <w:tcW w:w="585" w:type="dxa"/>
-            <w:shd w:val="clear" w:color="auto" w:fill="auto"/>
-            <w:tcMar/>
           </w:tcPr>
           <w:p>
             <w:pPr>
@@ -2306,8 +1963,6 @@
         <w:tc>
           <w:tcPr>
             <w:tcW w:w="628" w:type="dxa"/>
-            <w:shd w:val="clear" w:color="auto" w:fill="auto"/>
-            <w:tcMar/>
           </w:tcPr>
           <w:p>
             <w:pPr>
@@ -2320,7 +1975,6 @@
         <w:tc>
           <w:tcPr>
             <w:tcW w:w="851" w:type="dxa"/>
-            <w:tcMar/>
           </w:tcPr>
           <w:p>
             <w:pPr>
@@ -2340,8 +1994,6 @@
         <w:tc>
           <w:tcPr>
             <w:tcW w:w="7965" w:type="dxa"/>
-            <w:shd w:val="clear" w:color="auto" w:fill="auto"/>
-            <w:tcMar/>
           </w:tcPr>
           <w:p>
             <w:pPr>
@@ -2377,8 +2029,6 @@
         <w:tc>
           <w:tcPr>
             <w:tcW w:w="585" w:type="dxa"/>
-            <w:shd w:val="clear" w:color="auto" w:fill="auto"/>
-            <w:tcMar/>
           </w:tcPr>
           <w:p>
             <w:pPr>
@@ -2389,8 +2039,6 @@
         <w:tc>
           <w:tcPr>
             <w:tcW w:w="628" w:type="dxa"/>
-            <w:shd w:val="clear" w:color="auto" w:fill="auto"/>
-            <w:tcMar/>
           </w:tcPr>
           <w:p>
             <w:pPr>
@@ -2420,7 +2068,6 @@
           <w:szCs w:val="20"/>
           <w:shd w:val="clear" w:color="auto" w:fill="FFFFFF"/>
         </w:rPr>
-        <w:lastRenderedPageBreak/>
         <w:t xml:space="preserve">If ‘Yes’ to </w:t>
       </w:r>
       <w:r>
@@ -2474,40 +2121,32 @@
         </w:rPr>
         <w:t xml:space="preserve">the </w:t>
       </w:r>
-      <w:hyperlink w:history="1" r:id="rId16">
+      <w:hyperlink r:id="rId15" w:history="1">
         <w:r>
           <w:rPr>
             <w:rStyle w:val="Hyperlink"/>
             <w:szCs w:val="20"/>
             <w:shd w:val="clear" w:color="auto" w:fill="FFFFFF"/>
           </w:rPr>
-          <w:t xml:space="preserve">DPIA </w:t>
+          <w:t xml:space="preserve">DPIA pages of our </w:t>
         </w:r>
-        <w:bookmarkStart w:name="_GoBack" w:id="0"/>
-        <w:bookmarkEnd w:id="0"/>
+        <w:proofErr w:type="spellStart"/>
         <w:r>
           <w:rPr>
             <w:rStyle w:val="Hyperlink"/>
             <w:szCs w:val="20"/>
             <w:shd w:val="clear" w:color="auto" w:fill="FFFFFF"/>
           </w:rPr>
-          <w:t>p</w:t>
+          <w:t>Sharepoint</w:t>
         </w:r>
+        <w:proofErr w:type="spellEnd"/>
         <w:r>
           <w:rPr>
             <w:rStyle w:val="Hyperlink"/>
             <w:szCs w:val="20"/>
             <w:shd w:val="clear" w:color="auto" w:fill="FFFFFF"/>
           </w:rPr>
-          <w:t xml:space="preserve">ages of our </w:t>
-        </w:r>
-        <w:r>
-          <w:rPr>
-            <w:rStyle w:val="Hyperlink"/>
-            <w:szCs w:val="20"/>
-            <w:shd w:val="clear" w:color="auto" w:fill="FFFFFF"/>
-          </w:rPr>
-          <w:t>Sharepoint site</w:t>
+          <w:t xml:space="preserve"> site</w:t>
         </w:r>
       </w:hyperlink>
       <w:r>
@@ -2542,112 +2181,63 @@
       <w:pPr>
         <w:rPr>
           <w:shd w:val="clear" w:color="auto" w:fill="FFFFFF"/>
-          <w:lang w:val="en-GB"/>
         </w:rPr>
       </w:pPr>
       <w:r>
-        <w:rPr>
-          <w:lang w:val="en-GB"/>
-        </w:rPr>
         <w:t>I</w:t>
       </w:r>
       <w:r>
         <w:rPr>
-          <w:b w:val="1"/>
-          <w:bCs w:val="1"/>
-          <w:lang w:val="en-GB"/>
+          <w:b/>
+          <w:bCs/>
         </w:rPr>
         <w:t xml:space="preserve">f </w:t>
       </w:r>
       <w:r>
-        <w:rPr>
-          <w:lang w:val="en-GB"/>
-        </w:rPr>
         <w:t>‘</w:t>
       </w:r>
       <w:r>
         <w:rPr>
-          <w:b w:val="1"/>
-          <w:bCs w:val="1"/>
-          <w:lang w:val="en-GB"/>
+          <w:b/>
+          <w:bCs/>
         </w:rPr>
         <w:t>No</w:t>
       </w:r>
       <w:r>
-        <w:rPr>
-          <w:lang w:val="en-GB"/>
-        </w:rPr>
         <w:t xml:space="preserve">’ to </w:t>
       </w:r>
+      <w:proofErr w:type="gramStart"/>
       <w:r>
         <w:rPr>
-          <w:b w:val="1"/>
-          <w:bCs w:val="1"/>
+          <w:b/>
+          <w:bCs/>
           <w:u w:val="single"/>
-          <w:lang w:val="en-GB"/>
         </w:rPr>
         <w:t>all</w:t>
       </w:r>
       <w:r>
         <w:rPr>
-          <w:b w:val="1"/>
-          <w:bCs w:val="1"/>
-          <w:lang w:val="en-GB"/>
+          <w:b/>
+          <w:bCs/>
         </w:rPr>
         <w:t xml:space="preserve"> of</w:t>
       </w:r>
+      <w:proofErr w:type="gramEnd"/>
       <w:r>
         <w:rPr>
-          <w:b w:val="1"/>
-          <w:bCs w:val="1"/>
-          <w:lang w:val="en-GB"/>
-        </w:rPr>
-        <w:t xml:space="preserve"> these question</w:t>
+          <w:b/>
+          <w:bCs/>
+        </w:rPr>
+        <w:t xml:space="preserve"> these questions</w:t>
       </w:r>
       <w:r>
-        <w:rPr>
-          <w:b w:val="1"/>
-          <w:bCs w:val="1"/>
-          <w:lang w:val="en-GB"/>
-        </w:rPr>
-        <w:t>s</w:t>
+        <w:t xml:space="preserve">: you do not require to do a full DPIA.  </w:t>
       </w:r>
-      <w:r>
-        <w:rPr>
-          <w:lang w:val="en-GB"/>
-        </w:rPr>
-        <w:t>:</w:t>
-      </w:r>
-      <w:r>
-        <w:rPr>
-          <w:lang w:val="en-GB"/>
-        </w:rPr>
-        <w:t xml:space="preserve"> </w:t>
-      </w:r>
-      <w:r>
-        <w:rPr>
-          <w:lang w:val="en-GB"/>
-        </w:rPr>
-        <w:t xml:space="preserve">you do not </w:t>
-      </w:r>
-      <w:r>
-        <w:rPr>
-          <w:lang w:val="en-GB"/>
-        </w:rPr>
-        <w:t xml:space="preserve">require</w:t>
-      </w:r>
-      <w:r>
-        <w:rPr>
-          <w:lang w:val="en-GB"/>
-        </w:rPr>
-        <w:t xml:space="preserve"> to do a full DPIA.  </w:t>
-      </w:r>
-      <w:hyperlink w:history="1" r:id="R80de33094f5e48dc">
+      <w:hyperlink r:id="rId16" w:history="1">
         <w:r>
           <w:rPr>
             <w:rStyle w:val="Hyperlink"/>
             <w:shd w:val="clear" w:color="auto" w:fill="FFFFFF"/>
-            <w:lang w:val="en-GB"/>
           </w:rPr>
           <w:t>Return the form to the IGU</w:t>
         </w:r>
@@ -2655,28 +2245,13 @@
       <w:r>
         <w:rPr>
           <w:shd w:val="clear" w:color="auto" w:fill="FFFFFF"/>
-          <w:lang w:val="en-GB"/>
         </w:rPr>
         <w:t>.</w:t>
       </w:r>
     </w:p>
     <w:p>
-      <w:pPr>
-        <w:rPr>
-          <w:lang w:val="en-GB"/>
-        </w:rPr>
-      </w:pPr>
       <w:r>
-        <w:rPr>
-          <w:lang w:val="en-GB"/>
-        </w:rPr>
-        <w:t>You can still do a full DPIA if you feel it would be beneficial</w:t>
-      </w:r>
-      <w:r>
-        <w:rPr>
-          <w:lang w:val="en-GB"/>
-        </w:rPr>
-        <w:t xml:space="preserve">.  </w:t>
+        <w:t xml:space="preserve">You can still do a full DPIA if you feel it would be beneficial.  </w:t>
       </w:r>
     </w:p>
     <w:p>
@@ -2688,29 +2263,23 @@
       </w:pPr>
     </w:p>
     <w:sectPr>
-      <w:headerReference w:type="even" r:id="rId18"/>
+      <w:headerReference w:type="even" r:id="rId17"/>
+      <w:headerReference w:type="default" r:id="rId18"/>
       <w:footerReference w:type="default" r:id="rId19"/>
       <w:headerReference w:type="first" r:id="rId20"/>
       <w:footerReference w:type="first" r:id="rId21"/>
-      <w:pgSz w:w="11906" w:h="16838" w:orient="portrait" w:code="9"/>
+      <w:pgSz w:w="11906" w:h="16838" w:code="9"/>
       <w:pgMar w:top="1134" w:right="851" w:bottom="1134" w:left="1021" w:header="2835" w:footer="794" w:gutter="0"/>
       <w:cols w:space="708"/>
       <w:titlePg/>
       <w:docGrid w:linePitch="360"/>
-      <w:headerReference w:type="default" r:id="R261ca5ce7fab4105"/>
     </w:sectPr>
   </w:body>
 </w:document>
 </file>
 
-<file path=word/commentsIds.xml><?xml version="1.0" encoding="utf-8"?>
-<w16cid:commentsIds xmlns:wpc="http://schemas.microsoft.com/office/word/2010/wordprocessingCanvas" xmlns:cx="http://schemas.microsoft.com/office/drawing/2014/chartex" xmlns:cx1="http://schemas.microsoft.com/office/drawing/2015/9/8/chartex" xmlns:cx2="http://schemas.microsoft.com/office/drawing/2015/10/21/chartex" xmlns:cx3="http://schemas.microsoft.com/office/drawing/2016/5/9/chartex" xmlns:cx4="http://schemas.microsoft.com/office/drawing/2016/5/10/chartex" xmlns:cx5="http://schemas.microsoft.com/office/drawing/2016/5/11/chartex" xmlns:cx6="http://schemas.microsoft.com/office/drawing/2016/5/12/chartex" xmlns:cx7="http://schemas.microsoft.com/office/drawing/2016/5/13/chartex" xmlns:cx8="http://schemas.microsoft.com/office/drawing/2016/5/14/chartex" xmlns:mc="http://schemas.openxmlformats.org/markup-compatibility/2006" xmlns:aink="http://schemas.microsoft.com/office/drawing/2016/ink" xmlns:am3d="http://schemas.microsoft.com/office/drawing/2017/model3d" xmlns:o="urn:schemas-microsoft-com:office:office" xmlns:r="http://schemas.openxmlformats.org/officeDocument/2006/relationships" xmlns:m="http://schemas.openxmlformats.org/officeDocument/2006/math" xmlns:v="urn:schemas-microsoft-com:vml" xmlns:wp14="http://schemas.microsoft.com/office/word/2010/wordprocessingDrawing" xmlns:wp="http://schemas.openxmlformats.org/drawingml/2006/wordprocessingDrawing" xmlns:w10="urn:schemas-microsoft-com:office:word" xmlns:w="http://schemas.openxmlformats.org/wordprocessingml/2006/main" xmlns:w14="http://schemas.microsoft.com/office/word/2010/wordml" xmlns:w15="http://schemas.microsoft.com/office/word/2012/wordml" xmlns:w16cid="http://schemas.microsoft.com/office/word/2016/wordml/cid" xmlns:w16se="http://schemas.microsoft.com/office/word/2015/wordml/symex" xmlns:wpg="http://schemas.microsoft.com/office/word/2010/wordprocessingGroup" xmlns:wpi="http://schemas.microsoft.com/office/word/2010/wordprocessingInk" xmlns:wne="http://schemas.microsoft.com/office/word/2006/wordml" xmlns:wps="http://schemas.microsoft.com/office/word/2010/wordprocessingShape" mc:Ignorable="w14 w15 w16se w16cid wp14">
-  <w16cid:commentId w16cid:paraId="4AF1794F" w16cid:durableId="245640C0"/>
-</w16cid:commentsIds>
-</file>
-
 <file path=word/endnotes.xml><?xml version="1.0" encoding="utf-8"?>
-<w:endnotes xmlns:wpc="http://schemas.microsoft.com/office/word/2010/wordprocessingCanvas" xmlns:cx="http://schemas.microsoft.com/office/drawing/2014/chartex" xmlns:mc="http://schemas.openxmlformats.org/markup-compatibility/2006" xmlns:o="urn:schemas-microsoft-com:office:office" xmlns:r="http://schemas.openxmlformats.org/officeDocument/2006/relationships" xmlns:m="http://schemas.openxmlformats.org/officeDocument/2006/math" xmlns:v="urn:schemas-microsoft-com:vml" xmlns:wp14="http://schemas.microsoft.com/office/word/2010/wordprocessingDrawing" xmlns:wp="http://schemas.openxmlformats.org/drawingml/2006/wordprocessingDrawing" xmlns:w10="urn:schemas-microsoft-com:office:word" xmlns:w="http://schemas.openxmlformats.org/wordprocessingml/2006/main" xmlns:w14="http://schemas.microsoft.com/office/word/2010/wordml" xmlns:w15="http://schemas.microsoft.com/office/word/2012/wordml" xmlns:w16se="http://schemas.microsoft.com/office/word/2015/wordml/symex" xmlns:wpg="http://schemas.microsoft.com/office/word/2010/wordprocessingGroup" xmlns:wpi="http://schemas.microsoft.com/office/word/2010/wordprocessingInk" xmlns:wne="http://schemas.microsoft.com/office/word/2006/wordml" xmlns:wps="http://schemas.microsoft.com/office/word/2010/wordprocessingShape" mc:Ignorable="w14 w15 w16se wp14">
+<w:endnotes xmlns:wpc="http://schemas.microsoft.com/office/word/2010/wordprocessingCanvas" xmlns:cx="http://schemas.microsoft.com/office/drawing/2014/chartex" xmlns:cx1="http://schemas.microsoft.com/office/drawing/2015/9/8/chartex" xmlns:cx2="http://schemas.microsoft.com/office/drawing/2015/10/21/chartex" xmlns:cx3="http://schemas.microsoft.com/office/drawing/2016/5/9/chartex" xmlns:cx4="http://schemas.microsoft.com/office/drawing/2016/5/10/chartex" xmlns:cx5="http://schemas.microsoft.com/office/drawing/2016/5/11/chartex" xmlns:cx6="http://schemas.microsoft.com/office/drawing/2016/5/12/chartex" xmlns:cx7="http://schemas.microsoft.com/office/drawing/2016/5/13/chartex" xmlns:cx8="http://schemas.microsoft.com/office/drawing/2016/5/14/chartex" xmlns:mc="http://schemas.openxmlformats.org/markup-compatibility/2006" xmlns:aink="http://schemas.microsoft.com/office/drawing/2016/ink" xmlns:am3d="http://schemas.microsoft.com/office/drawing/2017/model3d" xmlns:o="urn:schemas-microsoft-com:office:office" xmlns:oel="http://schemas.microsoft.com/office/2019/extlst" xmlns:r="http://schemas.openxmlformats.org/officeDocument/2006/relationships" xmlns:m="http://schemas.openxmlformats.org/officeDocument/2006/math" xmlns:v="urn:schemas-microsoft-com:vml" xmlns:wp14="http://schemas.microsoft.com/office/word/2010/wordprocessingDrawing" xmlns:wp="http://schemas.openxmlformats.org/drawingml/2006/wordprocessingDrawing" xmlns:w10="urn:schemas-microsoft-com:office:word" xmlns:w="http://schemas.openxmlformats.org/wordprocessingml/2006/main" xmlns:w14="http://schemas.microsoft.com/office/word/2010/wordml" xmlns:w15="http://schemas.microsoft.com/office/word/2012/wordml" xmlns:w16cex="http://schemas.microsoft.com/office/word/2018/wordml/cex" xmlns:w16cid="http://schemas.microsoft.com/office/word/2016/wordml/cid" xmlns:w16="http://schemas.microsoft.com/office/word/2018/wordml" xmlns:w16du="http://schemas.microsoft.com/office/word/2023/wordml/word16du" xmlns:w16sdtdh="http://schemas.microsoft.com/office/word/2020/wordml/sdtdatahash" xmlns:w16sdtfl="http://schemas.microsoft.com/office/word/2024/wordml/sdtformatlock" xmlns:w16se="http://schemas.microsoft.com/office/word/2015/wordml/symex" xmlns:wpg="http://schemas.microsoft.com/office/word/2010/wordprocessingGroup" xmlns:wpi="http://schemas.microsoft.com/office/word/2010/wordprocessingInk" xmlns:wne="http://schemas.microsoft.com/office/word/2006/wordml" xmlns:wps="http://schemas.microsoft.com/office/word/2010/wordprocessingShape" mc:Ignorable="w14 w15 w16se w16cid w16 w16cex w16sdtdh w16sdtfl w16du wp14">
   <w:endnote w:type="separator" w:id="-1">
     <w:p>
       <w:pPr>
@@ -2735,7 +2304,7 @@
 </file>
 
 <file path=word/footer1.xml><?xml version="1.0" encoding="utf-8"?>
-<w:ftr xmlns:wpc="http://schemas.microsoft.com/office/word/2010/wordprocessingCanvas" xmlns:cx="http://schemas.microsoft.com/office/drawing/2014/chartex" xmlns:mc="http://schemas.openxmlformats.org/markup-compatibility/2006" xmlns:o="urn:schemas-microsoft-com:office:office" xmlns:r="http://schemas.openxmlformats.org/officeDocument/2006/relationships" xmlns:m="http://schemas.openxmlformats.org/officeDocument/2006/math" xmlns:v="urn:schemas-microsoft-com:vml" xmlns:wp14="http://schemas.microsoft.com/office/word/2010/wordprocessingDrawing" xmlns:wp="http://schemas.openxmlformats.org/drawingml/2006/wordprocessingDrawing" xmlns:w10="urn:schemas-microsoft-com:office:word" xmlns:w="http://schemas.openxmlformats.org/wordprocessingml/2006/main" xmlns:w14="http://schemas.microsoft.com/office/word/2010/wordml" xmlns:w15="http://schemas.microsoft.com/office/word/2012/wordml" xmlns:w16se="http://schemas.microsoft.com/office/word/2015/wordml/symex" xmlns:wpg="http://schemas.microsoft.com/office/word/2010/wordprocessingGroup" xmlns:wpi="http://schemas.microsoft.com/office/word/2010/wordprocessingInk" xmlns:wne="http://schemas.microsoft.com/office/word/2006/wordml" xmlns:wps="http://schemas.microsoft.com/office/word/2010/wordprocessingShape" mc:Ignorable="w14 w15 w16se wp14">
+<w:ftr xmlns:wpc="http://schemas.microsoft.com/office/word/2010/wordprocessingCanvas" xmlns:cx="http://schemas.microsoft.com/office/drawing/2014/chartex" xmlns:cx1="http://schemas.microsoft.com/office/drawing/2015/9/8/chartex" xmlns:cx2="http://schemas.microsoft.com/office/drawing/2015/10/21/chartex" xmlns:cx3="http://schemas.microsoft.com/office/drawing/2016/5/9/chartex" xmlns:cx4="http://schemas.microsoft.com/office/drawing/2016/5/10/chartex" xmlns:cx5="http://schemas.microsoft.com/office/drawing/2016/5/11/chartex" xmlns:cx6="http://schemas.microsoft.com/office/drawing/2016/5/12/chartex" xmlns:cx7="http://schemas.microsoft.com/office/drawing/2016/5/13/chartex" xmlns:cx8="http://schemas.microsoft.com/office/drawing/2016/5/14/chartex" xmlns:mc="http://schemas.openxmlformats.org/markup-compatibility/2006" xmlns:aink="http://schemas.microsoft.com/office/drawing/2016/ink" xmlns:am3d="http://schemas.microsoft.com/office/drawing/2017/model3d" xmlns:o="urn:schemas-microsoft-com:office:office" xmlns:oel="http://schemas.microsoft.com/office/2019/extlst" xmlns:r="http://schemas.openxmlformats.org/officeDocument/2006/relationships" xmlns:m="http://schemas.openxmlformats.org/officeDocument/2006/math" xmlns:v="urn:schemas-microsoft-com:vml" xmlns:wp14="http://schemas.microsoft.com/office/word/2010/wordprocessingDrawing" xmlns:wp="http://schemas.openxmlformats.org/drawingml/2006/wordprocessingDrawing" xmlns:w10="urn:schemas-microsoft-com:office:word" xmlns:w="http://schemas.openxmlformats.org/wordprocessingml/2006/main" xmlns:w14="http://schemas.microsoft.com/office/word/2010/wordml" xmlns:w15="http://schemas.microsoft.com/office/word/2012/wordml" xmlns:w16cex="http://schemas.microsoft.com/office/word/2018/wordml/cex" xmlns:w16cid="http://schemas.microsoft.com/office/word/2016/wordml/cid" xmlns:w16="http://schemas.microsoft.com/office/word/2018/wordml" xmlns:w16du="http://schemas.microsoft.com/office/word/2023/wordml/word16du" xmlns:w16sdtdh="http://schemas.microsoft.com/office/word/2020/wordml/sdtdatahash" xmlns:w16sdtfl="http://schemas.microsoft.com/office/word/2024/wordml/sdtformatlock" xmlns:w16se="http://schemas.microsoft.com/office/word/2015/wordml/symex" xmlns:wpg="http://schemas.microsoft.com/office/word/2010/wordprocessingGroup" xmlns:wpi="http://schemas.microsoft.com/office/word/2010/wordprocessingInk" xmlns:wne="http://schemas.microsoft.com/office/word/2006/wordml" xmlns:wps="http://schemas.microsoft.com/office/word/2010/wordprocessingShape" mc:Ignorable="w14 w15 w16se w16cid w16 w16cex w16sdtdh w16sdtfl w16du wp14">
   <w:p>
     <w:pPr>
       <w:pStyle w:val="Footer"/>
@@ -2758,7 +2327,7 @@
 </file>
 
 <file path=word/footer2.xml><?xml version="1.0" encoding="utf-8"?>
-<w:ftr xmlns:wpc="http://schemas.microsoft.com/office/word/2010/wordprocessingCanvas" xmlns:cx="http://schemas.microsoft.com/office/drawing/2014/chartex" xmlns:mc="http://schemas.openxmlformats.org/markup-compatibility/2006" xmlns:o="urn:schemas-microsoft-com:office:office" xmlns:r="http://schemas.openxmlformats.org/officeDocument/2006/relationships" xmlns:m="http://schemas.openxmlformats.org/officeDocument/2006/math" xmlns:v="urn:schemas-microsoft-com:vml" xmlns:wp14="http://schemas.microsoft.com/office/word/2010/wordprocessingDrawing" xmlns:wp="http://schemas.openxmlformats.org/drawingml/2006/wordprocessingDrawing" xmlns:w10="urn:schemas-microsoft-com:office:word" xmlns:w="http://schemas.openxmlformats.org/wordprocessingml/2006/main" xmlns:w14="http://schemas.microsoft.com/office/word/2010/wordml" xmlns:w15="http://schemas.microsoft.com/office/word/2012/wordml" xmlns:w16se="http://schemas.microsoft.com/office/word/2015/wordml/symex" xmlns:wpg="http://schemas.microsoft.com/office/word/2010/wordprocessingGroup" xmlns:wpi="http://schemas.microsoft.com/office/word/2010/wordprocessingInk" xmlns:wne="http://schemas.microsoft.com/office/word/2006/wordml" xmlns:wps="http://schemas.microsoft.com/office/word/2010/wordprocessingShape" xmlns:a="http://schemas.openxmlformats.org/drawingml/2006/main" xmlns:pic="http://schemas.openxmlformats.org/drawingml/2006/picture" xmlns:a14="http://schemas.microsoft.com/office/drawing/2010/main" mc:Ignorable="w14 w15 w16se wp14">
+<w:ftr xmlns:wpc="http://schemas.microsoft.com/office/word/2010/wordprocessingCanvas" xmlns:cx="http://schemas.microsoft.com/office/drawing/2014/chartex" xmlns:cx1="http://schemas.microsoft.com/office/drawing/2015/9/8/chartex" xmlns:cx2="http://schemas.microsoft.com/office/drawing/2015/10/21/chartex" xmlns:cx3="http://schemas.microsoft.com/office/drawing/2016/5/9/chartex" xmlns:cx4="http://schemas.microsoft.com/office/drawing/2016/5/10/chartex" xmlns:cx5="http://schemas.microsoft.com/office/drawing/2016/5/11/chartex" xmlns:cx6="http://schemas.microsoft.com/office/drawing/2016/5/12/chartex" xmlns:cx7="http://schemas.microsoft.com/office/drawing/2016/5/13/chartex" xmlns:cx8="http://schemas.microsoft.com/office/drawing/2016/5/14/chartex" xmlns:mc="http://schemas.openxmlformats.org/markup-compatibility/2006" xmlns:aink="http://schemas.microsoft.com/office/drawing/2016/ink" xmlns:am3d="http://schemas.microsoft.com/office/drawing/2017/model3d" xmlns:o="urn:schemas-microsoft-com:office:office" xmlns:oel="http://schemas.microsoft.com/office/2019/extlst" xmlns:r="http://schemas.openxmlformats.org/officeDocument/2006/relationships" xmlns:m="http://schemas.openxmlformats.org/officeDocument/2006/math" xmlns:v="urn:schemas-microsoft-com:vml" xmlns:wp14="http://schemas.microsoft.com/office/word/2010/wordprocessingDrawing" xmlns:wp="http://schemas.openxmlformats.org/drawingml/2006/wordprocessingDrawing" xmlns:w10="urn:schemas-microsoft-com:office:word" xmlns:w="http://schemas.openxmlformats.org/wordprocessingml/2006/main" xmlns:w14="http://schemas.microsoft.com/office/word/2010/wordml" xmlns:w15="http://schemas.microsoft.com/office/word/2012/wordml" xmlns:w16cex="http://schemas.microsoft.com/office/word/2018/wordml/cex" xmlns:w16cid="http://schemas.microsoft.com/office/word/2016/wordml/cid" xmlns:w16="http://schemas.microsoft.com/office/word/2018/wordml" xmlns:w16du="http://schemas.microsoft.com/office/word/2023/wordml/word16du" xmlns:w16sdtdh="http://schemas.microsoft.com/office/word/2020/wordml/sdtdatahash" xmlns:w16sdtfl="http://schemas.microsoft.com/office/word/2024/wordml/sdtformatlock" xmlns:w16se="http://schemas.microsoft.com/office/word/2015/wordml/symex" xmlns:wpg="http://schemas.microsoft.com/office/word/2010/wordprocessingGroup" xmlns:wpi="http://schemas.microsoft.com/office/word/2010/wordprocessingInk" xmlns:wne="http://schemas.microsoft.com/office/word/2006/wordml" xmlns:wps="http://schemas.microsoft.com/office/word/2010/wordprocessingShape" mc:Ignorable="w14 w15 w16se w16cid w16 w16cex w16sdtdh w16sdtfl w16du wp14">
   <w:p>
     <w:pPr>
       <w:pStyle w:val="Footer"/>
@@ -2868,7 +2437,7 @@
 </file>
 
 <file path=word/footnotes.xml><?xml version="1.0" encoding="utf-8"?>
-<w:footnotes xmlns:wpc="http://schemas.microsoft.com/office/word/2010/wordprocessingCanvas" xmlns:cx="http://schemas.microsoft.com/office/drawing/2014/chartex" xmlns:mc="http://schemas.openxmlformats.org/markup-compatibility/2006" xmlns:o="urn:schemas-microsoft-com:office:office" xmlns:r="http://schemas.openxmlformats.org/officeDocument/2006/relationships" xmlns:m="http://schemas.openxmlformats.org/officeDocument/2006/math" xmlns:v="urn:schemas-microsoft-com:vml" xmlns:wp14="http://schemas.microsoft.com/office/word/2010/wordprocessingDrawing" xmlns:wp="http://schemas.openxmlformats.org/drawingml/2006/wordprocessingDrawing" xmlns:w10="urn:schemas-microsoft-com:office:word" xmlns:w="http://schemas.openxmlformats.org/wordprocessingml/2006/main" xmlns:w14="http://schemas.microsoft.com/office/word/2010/wordml" xmlns:w15="http://schemas.microsoft.com/office/word/2012/wordml" xmlns:w16se="http://schemas.microsoft.com/office/word/2015/wordml/symex" xmlns:wpg="http://schemas.microsoft.com/office/word/2010/wordprocessingGroup" xmlns:wpi="http://schemas.microsoft.com/office/word/2010/wordprocessingInk" xmlns:wne="http://schemas.microsoft.com/office/word/2006/wordml" xmlns:wps="http://schemas.microsoft.com/office/word/2010/wordprocessingShape" mc:Ignorable="w14 w15 w16se wp14">
+<w:footnotes xmlns:wpc="http://schemas.microsoft.com/office/word/2010/wordprocessingCanvas" xmlns:cx="http://schemas.microsoft.com/office/drawing/2014/chartex" xmlns:cx1="http://schemas.microsoft.com/office/drawing/2015/9/8/chartex" xmlns:cx2="http://schemas.microsoft.com/office/drawing/2015/10/21/chartex" xmlns:cx3="http://schemas.microsoft.com/office/drawing/2016/5/9/chartex" xmlns:cx4="http://schemas.microsoft.com/office/drawing/2016/5/10/chartex" xmlns:cx5="http://schemas.microsoft.com/office/drawing/2016/5/11/chartex" xmlns:cx6="http://schemas.microsoft.com/office/drawing/2016/5/12/chartex" xmlns:cx7="http://schemas.microsoft.com/office/drawing/2016/5/13/chartex" xmlns:cx8="http://schemas.microsoft.com/office/drawing/2016/5/14/chartex" xmlns:mc="http://schemas.openxmlformats.org/markup-compatibility/2006" xmlns:aink="http://schemas.microsoft.com/office/drawing/2016/ink" xmlns:am3d="http://schemas.microsoft.com/office/drawing/2017/model3d" xmlns:o="urn:schemas-microsoft-com:office:office" xmlns:oel="http://schemas.microsoft.com/office/2019/extlst" xmlns:r="http://schemas.openxmlformats.org/officeDocument/2006/relationships" xmlns:m="http://schemas.openxmlformats.org/officeDocument/2006/math" xmlns:v="urn:schemas-microsoft-com:vml" xmlns:wp14="http://schemas.microsoft.com/office/word/2010/wordprocessingDrawing" xmlns:wp="http://schemas.openxmlformats.org/drawingml/2006/wordprocessingDrawing" xmlns:w10="urn:schemas-microsoft-com:office:word" xmlns:w="http://schemas.openxmlformats.org/wordprocessingml/2006/main" xmlns:w14="http://schemas.microsoft.com/office/word/2010/wordml" xmlns:w15="http://schemas.microsoft.com/office/word/2012/wordml" xmlns:w16cex="http://schemas.microsoft.com/office/word/2018/wordml/cex" xmlns:w16cid="http://schemas.microsoft.com/office/word/2016/wordml/cid" xmlns:w16="http://schemas.microsoft.com/office/word/2018/wordml" xmlns:w16du="http://schemas.microsoft.com/office/word/2023/wordml/word16du" xmlns:w16sdtdh="http://schemas.microsoft.com/office/word/2020/wordml/sdtdatahash" xmlns:w16sdtfl="http://schemas.microsoft.com/office/word/2024/wordml/sdtformatlock" xmlns:w16se="http://schemas.microsoft.com/office/word/2015/wordml/symex" xmlns:wpg="http://schemas.microsoft.com/office/word/2010/wordprocessingGroup" xmlns:wpi="http://schemas.microsoft.com/office/word/2010/wordprocessingInk" xmlns:wne="http://schemas.microsoft.com/office/word/2006/wordml" xmlns:wps="http://schemas.microsoft.com/office/word/2010/wordprocessingShape" mc:Ignorable="w14 w15 w16se w16cid w16 w16cex w16sdtdh w16sdtfl w16du wp14">
   <w:footnote w:type="separator" w:id="-1">
     <w:p>
       <w:pPr>
@@ -2893,7 +2462,7 @@
 </file>
 
 <file path=word/header1.xml><?xml version="1.0" encoding="utf-8"?>
-<w:hdr xmlns:wpc="http://schemas.microsoft.com/office/word/2010/wordprocessingCanvas" xmlns:cx="http://schemas.microsoft.com/office/drawing/2014/chartex" xmlns:mc="http://schemas.openxmlformats.org/markup-compatibility/2006" xmlns:o="urn:schemas-microsoft-com:office:office" xmlns:r="http://schemas.openxmlformats.org/officeDocument/2006/relationships" xmlns:m="http://schemas.openxmlformats.org/officeDocument/2006/math" xmlns:v="urn:schemas-microsoft-com:vml" xmlns:wp14="http://schemas.microsoft.com/office/word/2010/wordprocessingDrawing" xmlns:wp="http://schemas.openxmlformats.org/drawingml/2006/wordprocessingDrawing" xmlns:w10="urn:schemas-microsoft-com:office:word" xmlns:w="http://schemas.openxmlformats.org/wordprocessingml/2006/main" xmlns:w14="http://schemas.microsoft.com/office/word/2010/wordml" xmlns:w15="http://schemas.microsoft.com/office/word/2012/wordml" xmlns:w16se="http://schemas.microsoft.com/office/word/2015/wordml/symex" xmlns:wpg="http://schemas.microsoft.com/office/word/2010/wordprocessingGroup" xmlns:wpi="http://schemas.microsoft.com/office/word/2010/wordprocessingInk" xmlns:wne="http://schemas.microsoft.com/office/word/2006/wordml" xmlns:wps="http://schemas.microsoft.com/office/word/2010/wordprocessingShape" mc:Ignorable="w14 w15 w16se wp14">
+<w:hdr xmlns:wpc="http://schemas.microsoft.com/office/word/2010/wordprocessingCanvas" xmlns:cx="http://schemas.microsoft.com/office/drawing/2014/chartex" xmlns:cx1="http://schemas.microsoft.com/office/drawing/2015/9/8/chartex" xmlns:cx2="http://schemas.microsoft.com/office/drawing/2015/10/21/chartex" xmlns:cx3="http://schemas.microsoft.com/office/drawing/2016/5/9/chartex" xmlns:cx4="http://schemas.microsoft.com/office/drawing/2016/5/10/chartex" xmlns:cx5="http://schemas.microsoft.com/office/drawing/2016/5/11/chartex" xmlns:cx6="http://schemas.microsoft.com/office/drawing/2016/5/12/chartex" xmlns:cx7="http://schemas.microsoft.com/office/drawing/2016/5/13/chartex" xmlns:cx8="http://schemas.microsoft.com/office/drawing/2016/5/14/chartex" xmlns:mc="http://schemas.openxmlformats.org/markup-compatibility/2006" xmlns:aink="http://schemas.microsoft.com/office/drawing/2016/ink" xmlns:am3d="http://schemas.microsoft.com/office/drawing/2017/model3d" xmlns:o="urn:schemas-microsoft-com:office:office" xmlns:oel="http://schemas.microsoft.com/office/2019/extlst" xmlns:r="http://schemas.openxmlformats.org/officeDocument/2006/relationships" xmlns:m="http://schemas.openxmlformats.org/officeDocument/2006/math" xmlns:v="urn:schemas-microsoft-com:vml" xmlns:wp14="http://schemas.microsoft.com/office/word/2010/wordprocessingDrawing" xmlns:wp="http://schemas.openxmlformats.org/drawingml/2006/wordprocessingDrawing" xmlns:w10="urn:schemas-microsoft-com:office:word" xmlns:w="http://schemas.openxmlformats.org/wordprocessingml/2006/main" xmlns:w14="http://schemas.microsoft.com/office/word/2010/wordml" xmlns:w15="http://schemas.microsoft.com/office/word/2012/wordml" xmlns:w16cex="http://schemas.microsoft.com/office/word/2018/wordml/cex" xmlns:w16cid="http://schemas.microsoft.com/office/word/2016/wordml/cid" xmlns:w16="http://schemas.microsoft.com/office/word/2018/wordml" xmlns:w16du="http://schemas.microsoft.com/office/word/2023/wordml/word16du" xmlns:w16sdtdh="http://schemas.microsoft.com/office/word/2020/wordml/sdtdatahash" xmlns:w16sdtfl="http://schemas.microsoft.com/office/word/2024/wordml/sdtformatlock" xmlns:w16se="http://schemas.microsoft.com/office/word/2015/wordml/symex" xmlns:wpg="http://schemas.microsoft.com/office/word/2010/wordprocessingGroup" xmlns:wpi="http://schemas.microsoft.com/office/word/2010/wordprocessingInk" xmlns:wne="http://schemas.microsoft.com/office/word/2006/wordml" xmlns:wps="http://schemas.microsoft.com/office/word/2010/wordprocessingShape" mc:Ignorable="w14 w15 w16se w16cid w16 w16cex w16sdtdh w16sdtfl w16du wp14">
   <w:p>
     <w:pPr>
       <w:pStyle w:val="Header"/>
@@ -2903,7 +2472,7 @@
         <w:noProof/>
       </w:rPr>
       <w:pict w14:anchorId="3FF7BEE1">
-        <v:shapetype id="_x0000_t75" coordsize="21600,21600" filled="f" stroked="f" o:spt="75" o:preferrelative="t" path="m@4@5l@4@11@9@11@9@5xe">
+        <v:shapetype id="_x0000_t75" coordsize="21600,21600" o:spt="75" o:preferrelative="t" path="m@4@5l@4@11@9@11@9@5xe" filled="f" stroked="f">
           <v:stroke joinstyle="miter"/>
           <v:formulas>
             <v:f eqn="if lineDrawn pixelLineWidth 0"/>
@@ -2919,11 +2488,11 @@
             <v:f eqn="prod @7 21600 pixelHeight"/>
             <v:f eqn="sum @10 21600 0"/>
           </v:formulas>
-          <v:path gradientshapeok="t" o:connecttype="rect" o:extrusionok="f"/>
+          <v:path o:extrusionok="f" gradientshapeok="t" o:connecttype="rect"/>
           <o:lock v:ext="edit" aspectratio="t"/>
         </v:shapetype>
-        <v:shape id="WordPictureWatermark10033298" style="position:absolute;margin-left:0;margin-top:0;width:595.2pt;height:841.9pt;z-index:-251657728;mso-wrap-edited:f;mso-width-percent:0;mso-height-percent:0;mso-position-horizontal:center;mso-position-horizontal-relative:margin;mso-position-vertical:center;mso-position-vertical-relative:margin;mso-width-percent:0;mso-height-percent:0" alt="media" o:spid="_x0000_s2049" o:allowincell="f" type="#_x0000_t75">
-          <v:imagedata o:title="media" r:id="rId1"/>
+        <v:shape id="WordPictureWatermark10033298" o:spid="_x0000_s1025" type="#_x0000_t75" alt="media" style="position:absolute;margin-left:0;margin-top:0;width:595.2pt;height:841.9pt;z-index:-251657728;mso-wrap-edited:f;mso-width-percent:0;mso-height-percent:0;mso-position-horizontal:center;mso-position-horizontal-relative:margin;mso-position-vertical:center;mso-position-vertical-relative:margin;mso-width-percent:0;mso-height-percent:0" o:allowincell="f">
+          <v:imagedata r:id="rId1" o:title="media"/>
           <w10:wrap anchorx="margin" anchory="margin"/>
         </v:shape>
       </w:pict>
@@ -2933,7 +2502,68 @@
 </file>
 
 <file path=word/header2.xml><?xml version="1.0" encoding="utf-8"?>
-<w:hdr xmlns:wpc="http://schemas.microsoft.com/office/word/2010/wordprocessingCanvas" xmlns:cx="http://schemas.microsoft.com/office/drawing/2014/chartex" xmlns:mc="http://schemas.openxmlformats.org/markup-compatibility/2006" xmlns:o="urn:schemas-microsoft-com:office:office" xmlns:r="http://schemas.openxmlformats.org/officeDocument/2006/relationships" xmlns:m="http://schemas.openxmlformats.org/officeDocument/2006/math" xmlns:v="urn:schemas-microsoft-com:vml" xmlns:wp14="http://schemas.microsoft.com/office/word/2010/wordprocessingDrawing" xmlns:wp="http://schemas.openxmlformats.org/drawingml/2006/wordprocessingDrawing" xmlns:w10="urn:schemas-microsoft-com:office:word" xmlns:w="http://schemas.openxmlformats.org/wordprocessingml/2006/main" xmlns:w14="http://schemas.microsoft.com/office/word/2010/wordml" xmlns:w15="http://schemas.microsoft.com/office/word/2012/wordml" xmlns:w16se="http://schemas.microsoft.com/office/word/2015/wordml/symex" xmlns:wpg="http://schemas.microsoft.com/office/word/2010/wordprocessingGroup" xmlns:wpi="http://schemas.microsoft.com/office/word/2010/wordprocessingInk" xmlns:wne="http://schemas.microsoft.com/office/word/2006/wordml" xmlns:wps="http://schemas.microsoft.com/office/word/2010/wordprocessingShape" xmlns:a="http://schemas.openxmlformats.org/drawingml/2006/main" xmlns:pic="http://schemas.openxmlformats.org/drawingml/2006/picture" xmlns:a14="http://schemas.microsoft.com/office/drawing/2010/main" mc:Ignorable="w14 w15 w16se wp14">
+<w:hdr xmlns:wpc="http://schemas.microsoft.com/office/word/2010/wordprocessingCanvas" xmlns:cx="http://schemas.microsoft.com/office/drawing/2014/chartex" xmlns:cx1="http://schemas.microsoft.com/office/drawing/2015/9/8/chartex" xmlns:cx2="http://schemas.microsoft.com/office/drawing/2015/10/21/chartex" xmlns:cx3="http://schemas.microsoft.com/office/drawing/2016/5/9/chartex" xmlns:cx4="http://schemas.microsoft.com/office/drawing/2016/5/10/chartex" xmlns:cx5="http://schemas.microsoft.com/office/drawing/2016/5/11/chartex" xmlns:cx6="http://schemas.microsoft.com/office/drawing/2016/5/12/chartex" xmlns:cx7="http://schemas.microsoft.com/office/drawing/2016/5/13/chartex" xmlns:cx8="http://schemas.microsoft.com/office/drawing/2016/5/14/chartex" xmlns:mc="http://schemas.openxmlformats.org/markup-compatibility/2006" xmlns:aink="http://schemas.microsoft.com/office/drawing/2016/ink" xmlns:am3d="http://schemas.microsoft.com/office/drawing/2017/model3d" xmlns:o="urn:schemas-microsoft-com:office:office" xmlns:oel="http://schemas.microsoft.com/office/2019/extlst" xmlns:r="http://schemas.openxmlformats.org/officeDocument/2006/relationships" xmlns:m="http://schemas.openxmlformats.org/officeDocument/2006/math" xmlns:v="urn:schemas-microsoft-com:vml" xmlns:wp14="http://schemas.microsoft.com/office/word/2010/wordprocessingDrawing" xmlns:wp="http://schemas.openxmlformats.org/drawingml/2006/wordprocessingDrawing" xmlns:w10="urn:schemas-microsoft-com:office:word" xmlns:w="http://schemas.openxmlformats.org/wordprocessingml/2006/main" xmlns:w14="http://schemas.microsoft.com/office/word/2010/wordml" xmlns:w15="http://schemas.microsoft.com/office/word/2012/wordml" xmlns:w16cex="http://schemas.microsoft.com/office/word/2018/wordml/cex" xmlns:w16cid="http://schemas.microsoft.com/office/word/2016/wordml/cid" xmlns:w16="http://schemas.microsoft.com/office/word/2018/wordml" xmlns:w16du="http://schemas.microsoft.com/office/word/2023/wordml/word16du" xmlns:w16sdtdh="http://schemas.microsoft.com/office/word/2020/wordml/sdtdatahash" xmlns:w16sdtfl="http://schemas.microsoft.com/office/word/2024/wordml/sdtformatlock" xmlns:w16se="http://schemas.microsoft.com/office/word/2015/wordml/symex" xmlns:wpg="http://schemas.microsoft.com/office/word/2010/wordprocessingGroup" xmlns:wpi="http://schemas.microsoft.com/office/word/2010/wordprocessingInk" xmlns:wne="http://schemas.microsoft.com/office/word/2006/wordml" xmlns:wps="http://schemas.microsoft.com/office/word/2010/wordprocessingShape" mc:Ignorable="w14 w15 w16se w16cid w16 w16cex w16sdtdh w16sdtfl w16du wp14">
+  <w:tbl>
+    <w:tblPr>
+      <w:tblW w:w="0" w:type="auto"/>
+      <w:tblLayout w:type="fixed"/>
+      <w:tblLook w:val="06A0" w:firstRow="1" w:lastRow="0" w:firstColumn="1" w:lastColumn="0" w:noHBand="1" w:noVBand="1"/>
+    </w:tblPr>
+    <w:tblGrid>
+      <w:gridCol w:w="3340"/>
+      <w:gridCol w:w="3340"/>
+      <w:gridCol w:w="3340"/>
+    </w:tblGrid>
+    <w:tr>
+      <w:trPr>
+        <w:trHeight w:val="300"/>
+      </w:trPr>
+      <w:tc>
+        <w:tcPr>
+          <w:tcW w:w="3340" w:type="dxa"/>
+        </w:tcPr>
+        <w:p>
+          <w:pPr>
+            <w:pStyle w:val="Header"/>
+            <w:ind w:left="-115"/>
+          </w:pPr>
+        </w:p>
+      </w:tc>
+      <w:tc>
+        <w:tcPr>
+          <w:tcW w:w="3340" w:type="dxa"/>
+        </w:tcPr>
+        <w:p>
+          <w:pPr>
+            <w:pStyle w:val="Header"/>
+            <w:jc w:val="center"/>
+          </w:pPr>
+        </w:p>
+      </w:tc>
+      <w:tc>
+        <w:tcPr>
+          <w:tcW w:w="3340" w:type="dxa"/>
+        </w:tcPr>
+        <w:p>
+          <w:pPr>
+            <w:pStyle w:val="Header"/>
+            <w:ind w:right="-115"/>
+            <w:jc w:val="right"/>
+          </w:pPr>
+        </w:p>
+      </w:tc>
+    </w:tr>
+  </w:tbl>
+  <w:p>
+    <w:pPr>
+      <w:pStyle w:val="Header"/>
+    </w:pPr>
+  </w:p>
+</w:hdr>
+</file>
+
+<file path=word/header3.xml><?xml version="1.0" encoding="utf-8"?>
+<w:hdr xmlns:wpc="http://schemas.microsoft.com/office/word/2010/wordprocessingCanvas" xmlns:cx="http://schemas.microsoft.com/office/drawing/2014/chartex" xmlns:cx1="http://schemas.microsoft.com/office/drawing/2015/9/8/chartex" xmlns:cx2="http://schemas.microsoft.com/office/drawing/2015/10/21/chartex" xmlns:cx3="http://schemas.microsoft.com/office/drawing/2016/5/9/chartex" xmlns:cx4="http://schemas.microsoft.com/office/drawing/2016/5/10/chartex" xmlns:cx5="http://schemas.microsoft.com/office/drawing/2016/5/11/chartex" xmlns:cx6="http://schemas.microsoft.com/office/drawing/2016/5/12/chartex" xmlns:cx7="http://schemas.microsoft.com/office/drawing/2016/5/13/chartex" xmlns:cx8="http://schemas.microsoft.com/office/drawing/2016/5/14/chartex" xmlns:mc="http://schemas.openxmlformats.org/markup-compatibility/2006" xmlns:aink="http://schemas.microsoft.com/office/drawing/2016/ink" xmlns:am3d="http://schemas.microsoft.com/office/drawing/2017/model3d" xmlns:o="urn:schemas-microsoft-com:office:office" xmlns:oel="http://schemas.microsoft.com/office/2019/extlst" xmlns:r="http://schemas.openxmlformats.org/officeDocument/2006/relationships" xmlns:m="http://schemas.openxmlformats.org/officeDocument/2006/math" xmlns:v="urn:schemas-microsoft-com:vml" xmlns:wp14="http://schemas.microsoft.com/office/word/2010/wordprocessingDrawing" xmlns:wp="http://schemas.openxmlformats.org/drawingml/2006/wordprocessingDrawing" xmlns:w10="urn:schemas-microsoft-com:office:word" xmlns:w="http://schemas.openxmlformats.org/wordprocessingml/2006/main" xmlns:w14="http://schemas.microsoft.com/office/word/2010/wordml" xmlns:w15="http://schemas.microsoft.com/office/word/2012/wordml" xmlns:w16cex="http://schemas.microsoft.com/office/word/2018/wordml/cex" xmlns:w16cid="http://schemas.microsoft.com/office/word/2016/wordml/cid" xmlns:w16="http://schemas.microsoft.com/office/word/2018/wordml" xmlns:w16du="http://schemas.microsoft.com/office/word/2023/wordml/word16du" xmlns:w16sdtdh="http://schemas.microsoft.com/office/word/2020/wordml/sdtdatahash" xmlns:w16sdtfl="http://schemas.microsoft.com/office/word/2024/wordml/sdtformatlock" xmlns:w16se="http://schemas.microsoft.com/office/word/2015/wordml/symex" xmlns:wpg="http://schemas.microsoft.com/office/word/2010/wordprocessingGroup" xmlns:wpi="http://schemas.microsoft.com/office/word/2010/wordprocessingInk" xmlns:wne="http://schemas.microsoft.com/office/word/2006/wordml" xmlns:wps="http://schemas.microsoft.com/office/word/2010/wordprocessingShape" mc:Ignorable="w14 w15 w16se w16cid w16 w16cex w16sdtdh w16sdtfl w16du wp14">
   <w:p>
     <w:pPr>
       <w:pStyle w:val="Header"/>
@@ -3002,79 +2632,8 @@
 </w:hdr>
 </file>
 
-<file path=word/header3.xml><?xml version="1.0" encoding="utf-8"?>
-<w:hdr xmlns:w14="http://schemas.microsoft.com/office/word/2010/wordml" xmlns:w="http://schemas.openxmlformats.org/wordprocessingml/2006/main">
-  <w:tbl>
-    <w:tblPr>
-      <w:tblStyle w:val="TableNormal"/>
-      <w:bidiVisual w:val="0"/>
-      <w:tblW w:w="0" w:type="auto"/>
-      <w:tblLayout w:type="fixed"/>
-      <w:tblLook w:val="06A0" w:firstRow="1" w:lastRow="0" w:firstColumn="1" w:lastColumn="0" w:noHBand="1" w:noVBand="1"/>
-    </w:tblPr>
-    <w:tblGrid>
-      <w:gridCol w:w="3340"/>
-      <w:gridCol w:w="3340"/>
-      <w:gridCol w:w="3340"/>
-    </w:tblGrid>
-    <w:tr>
-      <w:trPr>
-        <w:trHeight w:val="300"/>
-      </w:trPr>
-      <w:tc>
-        <w:tcPr>
-          <w:tcW w:w="3340" w:type="dxa"/>
-          <w:tcMar/>
-        </w:tcPr>
-        <w:p>
-          <w:pPr>
-            <w:pStyle w:val="Header"/>
-            <w:bidi w:val="0"/>
-            <w:ind w:left="-115"/>
-            <w:jc w:val="left"/>
-          </w:pPr>
-        </w:p>
-      </w:tc>
-      <w:tc>
-        <w:tcPr>
-          <w:tcW w:w="3340" w:type="dxa"/>
-          <w:tcMar/>
-        </w:tcPr>
-        <w:p>
-          <w:pPr>
-            <w:pStyle w:val="Header"/>
-            <w:bidi w:val="0"/>
-            <w:jc w:val="center"/>
-          </w:pPr>
-        </w:p>
-      </w:tc>
-      <w:tc>
-        <w:tcPr>
-          <w:tcW w:w="3340" w:type="dxa"/>
-          <w:tcMar/>
-        </w:tcPr>
-        <w:p>
-          <w:pPr>
-            <w:pStyle w:val="Header"/>
-            <w:bidi w:val="0"/>
-            <w:ind w:right="-115"/>
-            <w:jc w:val="right"/>
-          </w:pPr>
-        </w:p>
-      </w:tc>
-    </w:tr>
-  </w:tbl>
-  <w:p>
-    <w:pPr>
-      <w:pStyle w:val="Header"/>
-      <w:bidi w:val="0"/>
-    </w:pPr>
-  </w:p>
-</w:hdr>
-</file>
-
 <file path=word/numbering.xml><?xml version="1.0" encoding="utf-8"?>
-<w:numbering xmlns:wpc="http://schemas.microsoft.com/office/word/2010/wordprocessingCanvas" xmlns:cx="http://schemas.microsoft.com/office/drawing/2014/chartex" xmlns:mc="http://schemas.openxmlformats.org/markup-compatibility/2006" xmlns:o="urn:schemas-microsoft-com:office:office" xmlns:r="http://schemas.openxmlformats.org/officeDocument/2006/relationships" xmlns:m="http://schemas.openxmlformats.org/officeDocument/2006/math" xmlns:v="urn:schemas-microsoft-com:vml" xmlns:wp14="http://schemas.microsoft.com/office/word/2010/wordprocessingDrawing" xmlns:wp="http://schemas.openxmlformats.org/drawingml/2006/wordprocessingDrawing" xmlns:w10="urn:schemas-microsoft-com:office:word" xmlns:w="http://schemas.openxmlformats.org/wordprocessingml/2006/main" xmlns:w14="http://schemas.microsoft.com/office/word/2010/wordml" xmlns:w15="http://schemas.microsoft.com/office/word/2012/wordml" xmlns:w16se="http://schemas.microsoft.com/office/word/2015/wordml/symex" xmlns:wpg="http://schemas.microsoft.com/office/word/2010/wordprocessingGroup" xmlns:wpi="http://schemas.microsoft.com/office/word/2010/wordprocessingInk" xmlns:wne="http://schemas.microsoft.com/office/word/2006/wordml" xmlns:wps="http://schemas.microsoft.com/office/word/2010/wordprocessingShape" mc:Ignorable="w14 w15 w16se wp14">
+<w:numbering xmlns:wpc="http://schemas.microsoft.com/office/word/2010/wordprocessingCanvas" xmlns:cx="http://schemas.microsoft.com/office/drawing/2014/chartex" xmlns:cx1="http://schemas.microsoft.com/office/drawing/2015/9/8/chartex" xmlns:cx2="http://schemas.microsoft.com/office/drawing/2015/10/21/chartex" xmlns:cx3="http://schemas.microsoft.com/office/drawing/2016/5/9/chartex" xmlns:cx4="http://schemas.microsoft.com/office/drawing/2016/5/10/chartex" xmlns:cx5="http://schemas.microsoft.com/office/drawing/2016/5/11/chartex" xmlns:cx6="http://schemas.microsoft.com/office/drawing/2016/5/12/chartex" xmlns:cx7="http://schemas.microsoft.com/office/drawing/2016/5/13/chartex" xmlns:cx8="http://schemas.microsoft.com/office/drawing/2016/5/14/chartex" xmlns:mc="http://schemas.openxmlformats.org/markup-compatibility/2006" xmlns:aink="http://schemas.microsoft.com/office/drawing/2016/ink" xmlns:am3d="http://schemas.microsoft.com/office/drawing/2017/model3d" xmlns:o="urn:schemas-microsoft-com:office:office" xmlns:oel="http://schemas.microsoft.com/office/2019/extlst" xmlns:r="http://schemas.openxmlformats.org/officeDocument/2006/relationships" xmlns:m="http://schemas.openxmlformats.org/officeDocument/2006/math" xmlns:v="urn:schemas-microsoft-com:vml" xmlns:wp14="http://schemas.microsoft.com/office/word/2010/wordprocessingDrawing" xmlns:wp="http://schemas.openxmlformats.org/drawingml/2006/wordprocessingDrawing" xmlns:w10="urn:schemas-microsoft-com:office:word" xmlns:w="http://schemas.openxmlformats.org/wordprocessingml/2006/main" xmlns:w14="http://schemas.microsoft.com/office/word/2010/wordml" xmlns:w15="http://schemas.microsoft.com/office/word/2012/wordml" xmlns:w16cex="http://schemas.microsoft.com/office/word/2018/wordml/cex" xmlns:w16cid="http://schemas.microsoft.com/office/word/2016/wordml/cid" xmlns:w16="http://schemas.microsoft.com/office/word/2018/wordml" xmlns:w16du="http://schemas.microsoft.com/office/word/2023/wordml/word16du" xmlns:w16sdtdh="http://schemas.microsoft.com/office/word/2020/wordml/sdtdatahash" xmlns:w16sdtfl="http://schemas.microsoft.com/office/word/2024/wordml/sdtformatlock" xmlns:w16se="http://schemas.microsoft.com/office/word/2015/wordml/symex" xmlns:wpg="http://schemas.microsoft.com/office/word/2010/wordprocessingGroup" xmlns:wpi="http://schemas.microsoft.com/office/word/2010/wordprocessingInk" xmlns:wne="http://schemas.microsoft.com/office/word/2006/wordml" xmlns:wps="http://schemas.microsoft.com/office/word/2010/wordprocessingShape" mc:Ignorable="w14 w15 w16se w16cid w16 w16cex w16sdtdh w16sdtfl w16du wp14">
   <w:abstractNum w:abstractNumId="0" w15:restartNumberingAfterBreak="0">
     <w:nsid w:val="073C3057"/>
     <w:multiLevelType w:val="hybridMultilevel"/>
@@ -3088,7 +2647,7 @@
         <w:ind w:left="720" w:hanging="360"/>
       </w:pPr>
       <w:rPr>
-        <w:rFonts w:hint="default" w:ascii="Arial" w:hAnsi="Arial" w:eastAsia="Calibri" w:cs="Arial"/>
+        <w:rFonts w:ascii="Arial" w:eastAsia="Calibri" w:hAnsi="Arial" w:cs="Arial" w:hint="default"/>
       </w:rPr>
     </w:lvl>
     <w:lvl w:ilvl="1" w:tplc="08090003" w:tentative="1">
@@ -3100,7 +2659,7 @@
         <w:ind w:left="1440" w:hanging="360"/>
       </w:pPr>
       <w:rPr>
-        <w:rFonts w:hint="default" w:ascii="Courier New" w:hAnsi="Courier New" w:cs="Courier New"/>
+        <w:rFonts w:ascii="Courier New" w:hAnsi="Courier New" w:cs="Courier New" w:hint="default"/>
       </w:rPr>
     </w:lvl>
     <w:lvl w:ilvl="2" w:tplc="08090005" w:tentative="1">
@@ -3112,7 +2671,7 @@
         <w:ind w:left="2160" w:hanging="360"/>
       </w:pPr>
       <w:rPr>
-        <w:rFonts w:hint="default" w:ascii="Wingdings" w:hAnsi="Wingdings"/>
+        <w:rFonts w:ascii="Wingdings" w:hAnsi="Wingdings" w:hint="default"/>
       </w:rPr>
     </w:lvl>
     <w:lvl w:ilvl="3" w:tplc="08090001" w:tentative="1">
@@ -3124,7 +2683,7 @@
         <w:ind w:left="2880" w:hanging="360"/>
       </w:pPr>
       <w:rPr>
-        <w:rFonts w:hint="default" w:ascii="Symbol" w:hAnsi="Symbol"/>
+        <w:rFonts w:ascii="Symbol" w:hAnsi="Symbol" w:hint="default"/>
       </w:rPr>
     </w:lvl>
     <w:lvl w:ilvl="4" w:tplc="08090003" w:tentative="1">
@@ -3136,7 +2695,7 @@
         <w:ind w:left="3600" w:hanging="360"/>
       </w:pPr>
       <w:rPr>
-        <w:rFonts w:hint="default" w:ascii="Courier New" w:hAnsi="Courier New" w:cs="Courier New"/>
+        <w:rFonts w:ascii="Courier New" w:hAnsi="Courier New" w:cs="Courier New" w:hint="default"/>
       </w:rPr>
     </w:lvl>
     <w:lvl w:ilvl="5" w:tplc="08090005" w:tentative="1">
@@ -3148,7 +2707,7 @@
         <w:ind w:left="4320" w:hanging="360"/>
       </w:pPr>
       <w:rPr>
-        <w:rFonts w:hint="default" w:ascii="Wingdings" w:hAnsi="Wingdings"/>
+        <w:rFonts w:ascii="Wingdings" w:hAnsi="Wingdings" w:hint="default"/>
       </w:rPr>
     </w:lvl>
     <w:lvl w:ilvl="6" w:tplc="08090001" w:tentative="1">
@@ -3160,7 +2719,7 @@
         <w:ind w:left="5040" w:hanging="360"/>
       </w:pPr>
       <w:rPr>
-        <w:rFonts w:hint="default" w:ascii="Symbol" w:hAnsi="Symbol"/>
+        <w:rFonts w:ascii="Symbol" w:hAnsi="Symbol" w:hint="default"/>
       </w:rPr>
     </w:lvl>
     <w:lvl w:ilvl="7" w:tplc="08090003" w:tentative="1">
@@ -3172,7 +2731,7 @@
         <w:ind w:left="5760" w:hanging="360"/>
       </w:pPr>
       <w:rPr>
-        <w:rFonts w:hint="default" w:ascii="Courier New" w:hAnsi="Courier New" w:cs="Courier New"/>
+        <w:rFonts w:ascii="Courier New" w:hAnsi="Courier New" w:cs="Courier New" w:hint="default"/>
       </w:rPr>
     </w:lvl>
     <w:lvl w:ilvl="8" w:tplc="08090005" w:tentative="1">
@@ -3184,7 +2743,7 @@
         <w:ind w:left="6480" w:hanging="360"/>
       </w:pPr>
       <w:rPr>
-        <w:rFonts w:hint="default" w:ascii="Wingdings" w:hAnsi="Wingdings"/>
+        <w:rFonts w:ascii="Wingdings" w:hAnsi="Wingdings" w:hint="default"/>
       </w:rPr>
     </w:lvl>
   </w:abstractNum>
@@ -3201,7 +2760,7 @@
         <w:ind w:left="720" w:hanging="360"/>
       </w:pPr>
       <w:rPr>
-        <w:rFonts w:hint="default" w:ascii="Arial" w:hAnsi="Arial" w:eastAsia="Calibri" w:cs="Arial"/>
+        <w:rFonts w:ascii="Arial" w:eastAsia="Calibri" w:hAnsi="Arial" w:cs="Arial" w:hint="default"/>
       </w:rPr>
     </w:lvl>
     <w:lvl w:ilvl="1" w:tplc="08090003" w:tentative="1">
@@ -3213,7 +2772,7 @@
         <w:ind w:left="1440" w:hanging="360"/>
       </w:pPr>
       <w:rPr>
-        <w:rFonts w:hint="default" w:ascii="Courier New" w:hAnsi="Courier New" w:cs="Courier New"/>
+        <w:rFonts w:ascii="Courier New" w:hAnsi="Courier New" w:cs="Courier New" w:hint="default"/>
       </w:rPr>
     </w:lvl>
     <w:lvl w:ilvl="2" w:tplc="08090005" w:tentative="1">
@@ -3225,7 +2784,7 @@
         <w:ind w:left="2160" w:hanging="360"/>
       </w:pPr>
       <w:rPr>
-        <w:rFonts w:hint="default" w:ascii="Wingdings" w:hAnsi="Wingdings"/>
+        <w:rFonts w:ascii="Wingdings" w:hAnsi="Wingdings" w:hint="default"/>
       </w:rPr>
     </w:lvl>
     <w:lvl w:ilvl="3" w:tplc="08090001" w:tentative="1">
@@ -3237,7 +2796,7 @@
         <w:ind w:left="2880" w:hanging="360"/>
       </w:pPr>
       <w:rPr>
-        <w:rFonts w:hint="default" w:ascii="Symbol" w:hAnsi="Symbol"/>
+        <w:rFonts w:ascii="Symbol" w:hAnsi="Symbol" w:hint="default"/>
       </w:rPr>
     </w:lvl>
     <w:lvl w:ilvl="4" w:tplc="08090003" w:tentative="1">
@@ -3249,7 +2808,7 @@
         <w:ind w:left="3600" w:hanging="360"/>
       </w:pPr>
       <w:rPr>
-        <w:rFonts w:hint="default" w:ascii="Courier New" w:hAnsi="Courier New" w:cs="Courier New"/>
+        <w:rFonts w:ascii="Courier New" w:hAnsi="Courier New" w:cs="Courier New" w:hint="default"/>
       </w:rPr>
     </w:lvl>
     <w:lvl w:ilvl="5" w:tplc="08090005" w:tentative="1">
@@ -3261,7 +2820,7 @@
         <w:ind w:left="4320" w:hanging="360"/>
       </w:pPr>
       <w:rPr>
-        <w:rFonts w:hint="default" w:ascii="Wingdings" w:hAnsi="Wingdings"/>
+        <w:rFonts w:ascii="Wingdings" w:hAnsi="Wingdings" w:hint="default"/>
       </w:rPr>
     </w:lvl>
     <w:lvl w:ilvl="6" w:tplc="08090001" w:tentative="1">
@@ -3273,7 +2832,7 @@
         <w:ind w:left="5040" w:hanging="360"/>
       </w:pPr>
       <w:rPr>
-        <w:rFonts w:hint="default" w:ascii="Symbol" w:hAnsi="Symbol"/>
+        <w:rFonts w:ascii="Symbol" w:hAnsi="Symbol" w:hint="default"/>
       </w:rPr>
     </w:lvl>
     <w:lvl w:ilvl="7" w:tplc="08090003" w:tentative="1">
@@ -3285,7 +2844,7 @@
         <w:ind w:left="5760" w:hanging="360"/>
       </w:pPr>
       <w:rPr>
-        <w:rFonts w:hint="default" w:ascii="Courier New" w:hAnsi="Courier New" w:cs="Courier New"/>
+        <w:rFonts w:ascii="Courier New" w:hAnsi="Courier New" w:cs="Courier New" w:hint="default"/>
       </w:rPr>
     </w:lvl>
     <w:lvl w:ilvl="8" w:tplc="08090005" w:tentative="1">
@@ -3297,7 +2856,7 @@
         <w:ind w:left="6480" w:hanging="360"/>
       </w:pPr>
       <w:rPr>
-        <w:rFonts w:hint="default" w:ascii="Wingdings" w:hAnsi="Wingdings"/>
+        <w:rFonts w:ascii="Wingdings" w:hAnsi="Wingdings" w:hint="default"/>
       </w:rPr>
     </w:lvl>
   </w:abstractNum>
@@ -3403,7 +2962,7 @@
         <w:ind w:left="720" w:hanging="360"/>
       </w:pPr>
       <w:rPr>
-        <w:rFonts w:hint="default" w:ascii="Arial" w:hAnsi="Arial" w:eastAsia="Calibri" w:cs="Arial"/>
+        <w:rFonts w:ascii="Arial" w:eastAsia="Calibri" w:hAnsi="Arial" w:cs="Arial" w:hint="default"/>
       </w:rPr>
     </w:lvl>
     <w:lvl w:ilvl="1" w:tplc="08090003" w:tentative="1">
@@ -3415,7 +2974,7 @@
         <w:ind w:left="1440" w:hanging="360"/>
       </w:pPr>
       <w:rPr>
-        <w:rFonts w:hint="default" w:ascii="Courier New" w:hAnsi="Courier New" w:cs="Courier New"/>
+        <w:rFonts w:ascii="Courier New" w:hAnsi="Courier New" w:cs="Courier New" w:hint="default"/>
       </w:rPr>
     </w:lvl>
     <w:lvl w:ilvl="2" w:tplc="08090005" w:tentative="1">
@@ -3427,7 +2986,7 @@
         <w:ind w:left="2160" w:hanging="360"/>
       </w:pPr>
       <w:rPr>
-        <w:rFonts w:hint="default" w:ascii="Wingdings" w:hAnsi="Wingdings"/>
+        <w:rFonts w:ascii="Wingdings" w:hAnsi="Wingdings" w:hint="default"/>
       </w:rPr>
     </w:lvl>
     <w:lvl w:ilvl="3" w:tplc="08090001" w:tentative="1">
@@ -3439,7 +2998,7 @@
         <w:ind w:left="2880" w:hanging="360"/>
       </w:pPr>
       <w:rPr>
-        <w:rFonts w:hint="default" w:ascii="Symbol" w:hAnsi="Symbol"/>
+        <w:rFonts w:ascii="Symbol" w:hAnsi="Symbol" w:hint="default"/>
       </w:rPr>
     </w:lvl>
     <w:lvl w:ilvl="4" w:tplc="08090003" w:tentative="1">
@@ -3451,7 +3010,7 @@
         <w:ind w:left="3600" w:hanging="360"/>
       </w:pPr>
       <w:rPr>
-        <w:rFonts w:hint="default" w:ascii="Courier New" w:hAnsi="Courier New" w:cs="Courier New"/>
+        <w:rFonts w:ascii="Courier New" w:hAnsi="Courier New" w:cs="Courier New" w:hint="default"/>
       </w:rPr>
     </w:lvl>
     <w:lvl w:ilvl="5" w:tplc="08090005" w:tentative="1">
@@ -3463,7 +3022,7 @@
         <w:ind w:left="4320" w:hanging="360"/>
       </w:pPr>
       <w:rPr>
-        <w:rFonts w:hint="default" w:ascii="Wingdings" w:hAnsi="Wingdings"/>
+        <w:rFonts w:ascii="Wingdings" w:hAnsi="Wingdings" w:hint="default"/>
       </w:rPr>
     </w:lvl>
     <w:lvl w:ilvl="6" w:tplc="08090001" w:tentative="1">
@@ -3475,7 +3034,7 @@
         <w:ind w:left="5040" w:hanging="360"/>
       </w:pPr>
       <w:rPr>
-        <w:rFonts w:hint="default" w:ascii="Symbol" w:hAnsi="Symbol"/>
+        <w:rFonts w:ascii="Symbol" w:hAnsi="Symbol" w:hint="default"/>
       </w:rPr>
     </w:lvl>
     <w:lvl w:ilvl="7" w:tplc="08090003" w:tentative="1">
@@ -3487,7 +3046,7 @@
         <w:ind w:left="5760" w:hanging="360"/>
       </w:pPr>
       <w:rPr>
-        <w:rFonts w:hint="default" w:ascii="Courier New" w:hAnsi="Courier New" w:cs="Courier New"/>
+        <w:rFonts w:ascii="Courier New" w:hAnsi="Courier New" w:cs="Courier New" w:hint="default"/>
       </w:rPr>
     </w:lvl>
     <w:lvl w:ilvl="8" w:tplc="08090005" w:tentative="1">
@@ -3499,7 +3058,7 @@
         <w:ind w:left="6480" w:hanging="360"/>
       </w:pPr>
       <w:rPr>
-        <w:rFonts w:hint="default" w:ascii="Wingdings" w:hAnsi="Wingdings"/>
+        <w:rFonts w:ascii="Wingdings" w:hAnsi="Wingdings" w:hint="default"/>
       </w:rPr>
     </w:lvl>
   </w:abstractNum>
@@ -3516,7 +3075,7 @@
         <w:ind w:left="720" w:hanging="360"/>
       </w:pPr>
       <w:rPr>
-        <w:rFonts w:hint="default" w:ascii="Symbol" w:hAnsi="Symbol"/>
+        <w:rFonts w:ascii="Symbol" w:hAnsi="Symbol" w:hint="default"/>
       </w:rPr>
     </w:lvl>
     <w:lvl w:ilvl="1" w:tplc="08090003">
@@ -3528,7 +3087,7 @@
         <w:ind w:left="1440" w:hanging="360"/>
       </w:pPr>
       <w:rPr>
-        <w:rFonts w:hint="default" w:ascii="Courier New" w:hAnsi="Courier New" w:cs="Courier New"/>
+        <w:rFonts w:ascii="Courier New" w:hAnsi="Courier New" w:cs="Courier New" w:hint="default"/>
       </w:rPr>
     </w:lvl>
     <w:lvl w:ilvl="2" w:tplc="08090005">
@@ -3540,7 +3099,7 @@
         <w:ind w:left="2160" w:hanging="360"/>
       </w:pPr>
       <w:rPr>
-        <w:rFonts w:hint="default" w:ascii="Wingdings" w:hAnsi="Wingdings"/>
+        <w:rFonts w:ascii="Wingdings" w:hAnsi="Wingdings" w:hint="default"/>
       </w:rPr>
     </w:lvl>
     <w:lvl w:ilvl="3" w:tplc="08090001">
@@ -3552,7 +3111,7 @@
         <w:ind w:left="2880" w:hanging="360"/>
       </w:pPr>
       <w:rPr>
-        <w:rFonts w:hint="default" w:ascii="Symbol" w:hAnsi="Symbol"/>
+        <w:rFonts w:ascii="Symbol" w:hAnsi="Symbol" w:hint="default"/>
       </w:rPr>
     </w:lvl>
     <w:lvl w:ilvl="4" w:tplc="08090003">
@@ -3564,7 +3123,7 @@
         <w:ind w:left="3600" w:hanging="360"/>
       </w:pPr>
       <w:rPr>
-        <w:rFonts w:hint="default" w:ascii="Courier New" w:hAnsi="Courier New" w:cs="Courier New"/>
+        <w:rFonts w:ascii="Courier New" w:hAnsi="Courier New" w:cs="Courier New" w:hint="default"/>
       </w:rPr>
     </w:lvl>
     <w:lvl w:ilvl="5" w:tplc="08090005">
@@ -3576,7 +3135,7 @@
         <w:ind w:left="4320" w:hanging="360"/>
       </w:pPr>
       <w:rPr>
-        <w:rFonts w:hint="default" w:ascii="Wingdings" w:hAnsi="Wingdings"/>
+        <w:rFonts w:ascii="Wingdings" w:hAnsi="Wingdings" w:hint="default"/>
       </w:rPr>
     </w:lvl>
     <w:lvl w:ilvl="6" w:tplc="08090001">
@@ -3588,7 +3147,7 @@
         <w:ind w:left="5040" w:hanging="360"/>
       </w:pPr>
       <w:rPr>
-        <w:rFonts w:hint="default" w:ascii="Symbol" w:hAnsi="Symbol"/>
+        <w:rFonts w:ascii="Symbol" w:hAnsi="Symbol" w:hint="default"/>
       </w:rPr>
     </w:lvl>
     <w:lvl w:ilvl="7" w:tplc="08090003">
@@ -3600,7 +3159,7 @@
         <w:ind w:left="5760" w:hanging="360"/>
       </w:pPr>
       <w:rPr>
-        <w:rFonts w:hint="default" w:ascii="Courier New" w:hAnsi="Courier New" w:cs="Courier New"/>
+        <w:rFonts w:ascii="Courier New" w:hAnsi="Courier New" w:cs="Courier New" w:hint="default"/>
       </w:rPr>
     </w:lvl>
     <w:lvl w:ilvl="8" w:tplc="08090005">
@@ -3612,7 +3171,7 @@
         <w:ind w:left="6480" w:hanging="360"/>
       </w:pPr>
       <w:rPr>
-        <w:rFonts w:hint="default" w:ascii="Wingdings" w:hAnsi="Wingdings"/>
+        <w:rFonts w:ascii="Wingdings" w:hAnsi="Wingdings" w:hint="default"/>
       </w:rPr>
     </w:lvl>
   </w:abstractNum>
@@ -3890,7 +3449,7 @@
         <w:ind w:left="720" w:hanging="360"/>
       </w:pPr>
       <w:rPr>
-        <w:rFonts w:hint="default" w:ascii="Arial" w:hAnsi="Arial" w:eastAsia="Calibri" w:cs="Arial"/>
+        <w:rFonts w:ascii="Arial" w:eastAsia="Calibri" w:hAnsi="Arial" w:cs="Arial" w:hint="default"/>
       </w:rPr>
     </w:lvl>
     <w:lvl w:ilvl="1" w:tplc="08090003" w:tentative="1">
@@ -3902,7 +3461,7 @@
         <w:ind w:left="1440" w:hanging="360"/>
       </w:pPr>
       <w:rPr>
-        <w:rFonts w:hint="default" w:ascii="Courier New" w:hAnsi="Courier New" w:cs="Courier New"/>
+        <w:rFonts w:ascii="Courier New" w:hAnsi="Courier New" w:cs="Courier New" w:hint="default"/>
       </w:rPr>
     </w:lvl>
     <w:lvl w:ilvl="2" w:tplc="08090005" w:tentative="1">
@@ -3914,7 +3473,7 @@
         <w:ind w:left="2160" w:hanging="360"/>
       </w:pPr>
       <w:rPr>
-        <w:rFonts w:hint="default" w:ascii="Wingdings" w:hAnsi="Wingdings"/>
+        <w:rFonts w:ascii="Wingdings" w:hAnsi="Wingdings" w:hint="default"/>
       </w:rPr>
     </w:lvl>
     <w:lvl w:ilvl="3" w:tplc="08090001" w:tentative="1">
@@ -3926,7 +3485,7 @@
         <w:ind w:left="2880" w:hanging="360"/>
       </w:pPr>
       <w:rPr>
-        <w:rFonts w:hint="default" w:ascii="Symbol" w:hAnsi="Symbol"/>
+        <w:rFonts w:ascii="Symbol" w:hAnsi="Symbol" w:hint="default"/>
       </w:rPr>
     </w:lvl>
     <w:lvl w:ilvl="4" w:tplc="08090003" w:tentative="1">
@@ -3938,7 +3497,7 @@
         <w:ind w:left="3600" w:hanging="360"/>
       </w:pPr>
       <w:rPr>
-        <w:rFonts w:hint="default" w:ascii="Courier New" w:hAnsi="Courier New" w:cs="Courier New"/>
+        <w:rFonts w:ascii="Courier New" w:hAnsi="Courier New" w:cs="Courier New" w:hint="default"/>
       </w:rPr>
     </w:lvl>
     <w:lvl w:ilvl="5" w:tplc="08090005" w:tentative="1">
@@ -3950,7 +3509,7 @@
         <w:ind w:left="4320" w:hanging="360"/>
       </w:pPr>
       <w:rPr>
-        <w:rFonts w:hint="default" w:ascii="Wingdings" w:hAnsi="Wingdings"/>
+        <w:rFonts w:ascii="Wingdings" w:hAnsi="Wingdings" w:hint="default"/>
       </w:rPr>
     </w:lvl>
     <w:lvl w:ilvl="6" w:tplc="08090001" w:tentative="1">
@@ -3962,7 +3521,7 @@
         <w:ind w:left="5040" w:hanging="360"/>
       </w:pPr>
       <w:rPr>
-        <w:rFonts w:hint="default" w:ascii="Symbol" w:hAnsi="Symbol"/>
+        <w:rFonts w:ascii="Symbol" w:hAnsi="Symbol" w:hint="default"/>
       </w:rPr>
     </w:lvl>
     <w:lvl w:ilvl="7" w:tplc="08090003" w:tentative="1">
@@ -3974,7 +3533,7 @@
         <w:ind w:left="5760" w:hanging="360"/>
       </w:pPr>
       <w:rPr>
-        <w:rFonts w:hint="default" w:ascii="Courier New" w:hAnsi="Courier New" w:cs="Courier New"/>
+        <w:rFonts w:ascii="Courier New" w:hAnsi="Courier New" w:cs="Courier New" w:hint="default"/>
       </w:rPr>
     </w:lvl>
     <w:lvl w:ilvl="8" w:tplc="08090005" w:tentative="1">
@@ -3986,7 +3545,7 @@
         <w:ind w:left="6480" w:hanging="360"/>
       </w:pPr>
       <w:rPr>
-        <w:rFonts w:hint="default" w:ascii="Wingdings" w:hAnsi="Wingdings"/>
+        <w:rFonts w:ascii="Wingdings" w:hAnsi="Wingdings" w:hint="default"/>
       </w:rPr>
     </w:lvl>
   </w:abstractNum>
@@ -4089,7 +3648,7 @@
         <w:ind w:left="720" w:hanging="360"/>
       </w:pPr>
       <w:rPr>
-        <w:rFonts w:hint="default" w:ascii="Arial" w:hAnsi="Arial"/>
+        <w:rFonts w:ascii="Arial" w:hAnsi="Arial" w:hint="default"/>
       </w:rPr>
     </w:lvl>
     <w:lvl w:ilvl="1" w:tplc="08090003" w:tentative="1">
@@ -4101,7 +3660,7 @@
         <w:ind w:left="1440" w:hanging="360"/>
       </w:pPr>
       <w:rPr>
-        <w:rFonts w:hint="default" w:ascii="Courier New" w:hAnsi="Courier New"/>
+        <w:rFonts w:ascii="Courier New" w:hAnsi="Courier New" w:hint="default"/>
       </w:rPr>
     </w:lvl>
     <w:lvl w:ilvl="2" w:tplc="08090005" w:tentative="1">
@@ -4113,7 +3672,7 @@
         <w:ind w:left="2160" w:hanging="360"/>
       </w:pPr>
       <w:rPr>
-        <w:rFonts w:hint="default" w:ascii="Wingdings" w:hAnsi="Wingdings"/>
+        <w:rFonts w:ascii="Wingdings" w:hAnsi="Wingdings" w:hint="default"/>
       </w:rPr>
     </w:lvl>
     <w:lvl w:ilvl="3" w:tplc="08090001" w:tentative="1">
@@ -4125,7 +3684,7 @@
         <w:ind w:left="2880" w:hanging="360"/>
       </w:pPr>
       <w:rPr>
-        <w:rFonts w:hint="default" w:ascii="Symbol" w:hAnsi="Symbol"/>
+        <w:rFonts w:ascii="Symbol" w:hAnsi="Symbol" w:hint="default"/>
       </w:rPr>
     </w:lvl>
     <w:lvl w:ilvl="4" w:tplc="08090003" w:tentative="1">
@@ -4137,7 +3696,7 @@
         <w:ind w:left="3600" w:hanging="360"/>
       </w:pPr>
       <w:rPr>
-        <w:rFonts w:hint="default" w:ascii="Courier New" w:hAnsi="Courier New"/>
+        <w:rFonts w:ascii="Courier New" w:hAnsi="Courier New" w:hint="default"/>
       </w:rPr>
     </w:lvl>
     <w:lvl w:ilvl="5" w:tplc="08090005" w:tentative="1">
@@ -4149,7 +3708,7 @@
         <w:ind w:left="4320" w:hanging="360"/>
       </w:pPr>
       <w:rPr>
-        <w:rFonts w:hint="default" w:ascii="Wingdings" w:hAnsi="Wingdings"/>
+        <w:rFonts w:ascii="Wingdings" w:hAnsi="Wingdings" w:hint="default"/>
       </w:rPr>
     </w:lvl>
     <w:lvl w:ilvl="6" w:tplc="08090001" w:tentative="1">
@@ -4161,7 +3720,7 @@
         <w:ind w:left="5040" w:hanging="360"/>
       </w:pPr>
       <w:rPr>
-        <w:rFonts w:hint="default" w:ascii="Symbol" w:hAnsi="Symbol"/>
+        <w:rFonts w:ascii="Symbol" w:hAnsi="Symbol" w:hint="default"/>
       </w:rPr>
     </w:lvl>
     <w:lvl w:ilvl="7" w:tplc="08090003" w:tentative="1">
@@ -4173,7 +3732,7 @@
         <w:ind w:left="5760" w:hanging="360"/>
       </w:pPr>
       <w:rPr>
-        <w:rFonts w:hint="default" w:ascii="Courier New" w:hAnsi="Courier New"/>
+        <w:rFonts w:ascii="Courier New" w:hAnsi="Courier New" w:hint="default"/>
       </w:rPr>
     </w:lvl>
     <w:lvl w:ilvl="8" w:tplc="08090005" w:tentative="1">
@@ -4185,7 +3744,7 @@
         <w:ind w:left="6480" w:hanging="360"/>
       </w:pPr>
       <w:rPr>
-        <w:rFonts w:hint="default" w:ascii="Wingdings" w:hAnsi="Wingdings"/>
+        <w:rFonts w:ascii="Wingdings" w:hAnsi="Wingdings" w:hint="default"/>
       </w:rPr>
     </w:lvl>
   </w:abstractNum>
@@ -4202,7 +3761,7 @@
         <w:ind w:left="720" w:hanging="360"/>
       </w:pPr>
       <w:rPr>
-        <w:rFonts w:hint="default" w:ascii="Arial" w:hAnsi="Arial" w:eastAsia="Calibri" w:cs="Arial"/>
+        <w:rFonts w:ascii="Arial" w:eastAsia="Calibri" w:hAnsi="Arial" w:cs="Arial" w:hint="default"/>
       </w:rPr>
     </w:lvl>
     <w:lvl w:ilvl="1" w:tplc="08090003" w:tentative="1">
@@ -4214,7 +3773,7 @@
         <w:ind w:left="1440" w:hanging="360"/>
       </w:pPr>
       <w:rPr>
-        <w:rFonts w:hint="default" w:ascii="Courier New" w:hAnsi="Courier New" w:cs="Courier New"/>
+        <w:rFonts w:ascii="Courier New" w:hAnsi="Courier New" w:cs="Courier New" w:hint="default"/>
       </w:rPr>
     </w:lvl>
     <w:lvl w:ilvl="2" w:tplc="08090005" w:tentative="1">
@@ -4226,7 +3785,7 @@
         <w:ind w:left="2160" w:hanging="360"/>
       </w:pPr>
       <w:rPr>
-        <w:rFonts w:hint="default" w:ascii="Wingdings" w:hAnsi="Wingdings"/>
+        <w:rFonts w:ascii="Wingdings" w:hAnsi="Wingdings" w:hint="default"/>
       </w:rPr>
     </w:lvl>
     <w:lvl w:ilvl="3" w:tplc="08090001" w:tentative="1">
@@ -4238,7 +3797,7 @@
         <w:ind w:left="2880" w:hanging="360"/>
       </w:pPr>
       <w:rPr>
-        <w:rFonts w:hint="default" w:ascii="Symbol" w:hAnsi="Symbol"/>
+        <w:rFonts w:ascii="Symbol" w:hAnsi="Symbol" w:hint="default"/>
       </w:rPr>
     </w:lvl>
     <w:lvl w:ilvl="4" w:tplc="08090003" w:tentative="1">
@@ -4250,7 +3809,7 @@
         <w:ind w:left="3600" w:hanging="360"/>
       </w:pPr>
       <w:rPr>
-        <w:rFonts w:hint="default" w:ascii="Courier New" w:hAnsi="Courier New" w:cs="Courier New"/>
+        <w:rFonts w:ascii="Courier New" w:hAnsi="Courier New" w:cs="Courier New" w:hint="default"/>
       </w:rPr>
     </w:lvl>
     <w:lvl w:ilvl="5" w:tplc="08090005" w:tentative="1">
@@ -4262,7 +3821,7 @@
         <w:ind w:left="4320" w:hanging="360"/>
       </w:pPr>
       <w:rPr>
-        <w:rFonts w:hint="default" w:ascii="Wingdings" w:hAnsi="Wingdings"/>
+        <w:rFonts w:ascii="Wingdings" w:hAnsi="Wingdings" w:hint="default"/>
       </w:rPr>
     </w:lvl>
     <w:lvl w:ilvl="6" w:tplc="08090001" w:tentative="1">
@@ -4274,7 +3833,7 @@
         <w:ind w:left="5040" w:hanging="360"/>
       </w:pPr>
       <w:rPr>
-        <w:rFonts w:hint="default" w:ascii="Symbol" w:hAnsi="Symbol"/>
+        <w:rFonts w:ascii="Symbol" w:hAnsi="Symbol" w:hint="default"/>
       </w:rPr>
     </w:lvl>
     <w:lvl w:ilvl="7" w:tplc="08090003" w:tentative="1">
@@ -4286,7 +3845,7 @@
         <w:ind w:left="5760" w:hanging="360"/>
       </w:pPr>
       <w:rPr>
-        <w:rFonts w:hint="default" w:ascii="Courier New" w:hAnsi="Courier New" w:cs="Courier New"/>
+        <w:rFonts w:ascii="Courier New" w:hAnsi="Courier New" w:cs="Courier New" w:hint="default"/>
       </w:rPr>
     </w:lvl>
     <w:lvl w:ilvl="8" w:tplc="08090005" w:tentative="1">
@@ -4298,7 +3857,7 @@
         <w:ind w:left="6480" w:hanging="360"/>
       </w:pPr>
       <w:rPr>
-        <w:rFonts w:hint="default" w:ascii="Wingdings" w:hAnsi="Wingdings"/>
+        <w:rFonts w:ascii="Wingdings" w:hAnsi="Wingdings" w:hint="default"/>
       </w:rPr>
     </w:lvl>
   </w:abstractNum>
@@ -4315,7 +3874,7 @@
         <w:ind w:left="720" w:hanging="360"/>
       </w:pPr>
       <w:rPr>
-        <w:rFonts w:hint="default" w:ascii="Symbol" w:hAnsi="Symbol"/>
+        <w:rFonts w:ascii="Symbol" w:hAnsi="Symbol" w:hint="default"/>
       </w:rPr>
     </w:lvl>
     <w:lvl w:ilvl="1" w:tplc="08090003" w:tentative="1">
@@ -4327,7 +3886,7 @@
         <w:ind w:left="1440" w:hanging="360"/>
       </w:pPr>
       <w:rPr>
-        <w:rFonts w:hint="default" w:ascii="Courier New" w:hAnsi="Courier New" w:cs="Courier New"/>
+        <w:rFonts w:ascii="Courier New" w:hAnsi="Courier New" w:cs="Courier New" w:hint="default"/>
       </w:rPr>
     </w:lvl>
     <w:lvl w:ilvl="2" w:tplc="08090005" w:tentative="1">
@@ -4339,7 +3898,7 @@
         <w:ind w:left="2160" w:hanging="360"/>
       </w:pPr>
       <w:rPr>
-        <w:rFonts w:hint="default" w:ascii="Wingdings" w:hAnsi="Wingdings"/>
+        <w:rFonts w:ascii="Wingdings" w:hAnsi="Wingdings" w:hint="default"/>
       </w:rPr>
     </w:lvl>
     <w:lvl w:ilvl="3" w:tplc="08090001" w:tentative="1">
@@ -4351,7 +3910,7 @@
         <w:ind w:left="2880" w:hanging="360"/>
       </w:pPr>
       <w:rPr>
-        <w:rFonts w:hint="default" w:ascii="Symbol" w:hAnsi="Symbol"/>
+        <w:rFonts w:ascii="Symbol" w:hAnsi="Symbol" w:hint="default"/>
       </w:rPr>
     </w:lvl>
     <w:lvl w:ilvl="4" w:tplc="08090003" w:tentative="1">
@@ -4363,7 +3922,7 @@
         <w:ind w:left="3600" w:hanging="360"/>
       </w:pPr>
       <w:rPr>
-        <w:rFonts w:hint="default" w:ascii="Courier New" w:hAnsi="Courier New" w:cs="Courier New"/>
+        <w:rFonts w:ascii="Courier New" w:hAnsi="Courier New" w:cs="Courier New" w:hint="default"/>
       </w:rPr>
     </w:lvl>
     <w:lvl w:ilvl="5" w:tplc="08090005" w:tentative="1">
@@ -4375,7 +3934,7 @@
         <w:ind w:left="4320" w:hanging="360"/>
       </w:pPr>
       <w:rPr>
-        <w:rFonts w:hint="default" w:ascii="Wingdings" w:hAnsi="Wingdings"/>
+        <w:rFonts w:ascii="Wingdings" w:hAnsi="Wingdings" w:hint="default"/>
       </w:rPr>
     </w:lvl>
     <w:lvl w:ilvl="6" w:tplc="08090001" w:tentative="1">
@@ -4387,7 +3946,7 @@
         <w:ind w:left="5040" w:hanging="360"/>
       </w:pPr>
       <w:rPr>
-        <w:rFonts w:hint="default" w:ascii="Symbol" w:hAnsi="Symbol"/>
+        <w:rFonts w:ascii="Symbol" w:hAnsi="Symbol" w:hint="default"/>
       </w:rPr>
     </w:lvl>
     <w:lvl w:ilvl="7" w:tplc="08090003" w:tentative="1">
@@ -4399,7 +3958,7 @@
         <w:ind w:left="5760" w:hanging="360"/>
       </w:pPr>
       <w:rPr>
-        <w:rFonts w:hint="default" w:ascii="Courier New" w:hAnsi="Courier New" w:cs="Courier New"/>
+        <w:rFonts w:ascii="Courier New" w:hAnsi="Courier New" w:cs="Courier New" w:hint="default"/>
       </w:rPr>
     </w:lvl>
     <w:lvl w:ilvl="8" w:tplc="08090005" w:tentative="1">
@@ -4411,7 +3970,7 @@
         <w:ind w:left="6480" w:hanging="360"/>
       </w:pPr>
       <w:rPr>
-        <w:rFonts w:hint="default" w:ascii="Wingdings" w:hAnsi="Wingdings"/>
+        <w:rFonts w:ascii="Wingdings" w:hAnsi="Wingdings" w:hint="default"/>
       </w:rPr>
     </w:lvl>
   </w:abstractNum>
@@ -4428,7 +3987,7 @@
         <w:ind w:left="720" w:hanging="360"/>
       </w:pPr>
       <w:rPr>
-        <w:rFonts w:hint="default" w:ascii="Arial" w:hAnsi="Arial" w:eastAsia="Calibri" w:cs="Arial"/>
+        <w:rFonts w:ascii="Arial" w:eastAsia="Calibri" w:hAnsi="Arial" w:cs="Arial" w:hint="default"/>
       </w:rPr>
     </w:lvl>
     <w:lvl w:ilvl="1" w:tplc="08090003" w:tentative="1">
@@ -4440,7 +3999,7 @@
         <w:ind w:left="1440" w:hanging="360"/>
       </w:pPr>
       <w:rPr>
-        <w:rFonts w:hint="default" w:ascii="Courier New" w:hAnsi="Courier New" w:cs="Courier New"/>
+        <w:rFonts w:ascii="Courier New" w:hAnsi="Courier New" w:cs="Courier New" w:hint="default"/>
       </w:rPr>
     </w:lvl>
     <w:lvl w:ilvl="2" w:tplc="08090005" w:tentative="1">
@@ -4452,7 +4011,7 @@
         <w:ind w:left="2160" w:hanging="360"/>
       </w:pPr>
       <w:rPr>
-        <w:rFonts w:hint="default" w:ascii="Wingdings" w:hAnsi="Wingdings"/>
+        <w:rFonts w:ascii="Wingdings" w:hAnsi="Wingdings" w:hint="default"/>
       </w:rPr>
     </w:lvl>
     <w:lvl w:ilvl="3" w:tplc="08090001" w:tentative="1">
@@ -4464,7 +4023,7 @@
         <w:ind w:left="2880" w:hanging="360"/>
       </w:pPr>
       <w:rPr>
-        <w:rFonts w:hint="default" w:ascii="Symbol" w:hAnsi="Symbol"/>
+        <w:rFonts w:ascii="Symbol" w:hAnsi="Symbol" w:hint="default"/>
       </w:rPr>
     </w:lvl>
     <w:lvl w:ilvl="4" w:tplc="08090003" w:tentative="1">
@@ -4476,7 +4035,7 @@
         <w:ind w:left="3600" w:hanging="360"/>
       </w:pPr>
       <w:rPr>
-        <w:rFonts w:hint="default" w:ascii="Courier New" w:hAnsi="Courier New" w:cs="Courier New"/>
+        <w:rFonts w:ascii="Courier New" w:hAnsi="Courier New" w:cs="Courier New" w:hint="default"/>
       </w:rPr>
     </w:lvl>
     <w:lvl w:ilvl="5" w:tplc="08090005" w:tentative="1">
@@ -4488,7 +4047,7 @@
         <w:ind w:left="4320" w:hanging="360"/>
       </w:pPr>
       <w:rPr>
-        <w:rFonts w:hint="default" w:ascii="Wingdings" w:hAnsi="Wingdings"/>
+        <w:rFonts w:ascii="Wingdings" w:hAnsi="Wingdings" w:hint="default"/>
       </w:rPr>
     </w:lvl>
     <w:lvl w:ilvl="6" w:tplc="08090001" w:tentative="1">
@@ -4500,7 +4059,7 @@
         <w:ind w:left="5040" w:hanging="360"/>
       </w:pPr>
       <w:rPr>
-        <w:rFonts w:hint="default" w:ascii="Symbol" w:hAnsi="Symbol"/>
+        <w:rFonts w:ascii="Symbol" w:hAnsi="Symbol" w:hint="default"/>
       </w:rPr>
     </w:lvl>
     <w:lvl w:ilvl="7" w:tplc="08090003" w:tentative="1">
@@ -4512,7 +4071,7 @@
         <w:ind w:left="5760" w:hanging="360"/>
       </w:pPr>
       <w:rPr>
-        <w:rFonts w:hint="default" w:ascii="Courier New" w:hAnsi="Courier New" w:cs="Courier New"/>
+        <w:rFonts w:ascii="Courier New" w:hAnsi="Courier New" w:cs="Courier New" w:hint="default"/>
       </w:rPr>
     </w:lvl>
     <w:lvl w:ilvl="8" w:tplc="08090005" w:tentative="1">
@@ -4524,7 +4083,7 @@
         <w:ind w:left="6480" w:hanging="360"/>
       </w:pPr>
       <w:rPr>
-        <w:rFonts w:hint="default" w:ascii="Wingdings" w:hAnsi="Wingdings"/>
+        <w:rFonts w:ascii="Wingdings" w:hAnsi="Wingdings" w:hint="default"/>
       </w:rPr>
     </w:lvl>
   </w:abstractNum>
@@ -4614,63 +4173,63 @@
       </w:pPr>
     </w:lvl>
   </w:abstractNum>
-  <w:num w:numId="1">
+  <w:num w:numId="1" w16cid:durableId="1598320561">
     <w:abstractNumId w:val="10"/>
   </w:num>
-  <w:num w:numId="2">
+  <w:num w:numId="2" w16cid:durableId="2047484000">
     <w:abstractNumId w:val="4"/>
   </w:num>
-  <w:num w:numId="3">
+  <w:num w:numId="3" w16cid:durableId="51850150">
     <w:abstractNumId w:val="4"/>
   </w:num>
-  <w:num w:numId="4">
+  <w:num w:numId="4" w16cid:durableId="1032538954">
     <w:abstractNumId w:val="2"/>
   </w:num>
-  <w:num w:numId="5">
+  <w:num w:numId="5" w16cid:durableId="249432881">
     <w:abstractNumId w:val="14"/>
   </w:num>
-  <w:num w:numId="6">
+  <w:num w:numId="6" w16cid:durableId="1058475852">
     <w:abstractNumId w:val="7"/>
   </w:num>
-  <w:num w:numId="7">
+  <w:num w:numId="7" w16cid:durableId="2144541569">
     <w:abstractNumId w:val="1"/>
   </w:num>
-  <w:num w:numId="8">
+  <w:num w:numId="8" w16cid:durableId="531575309">
     <w:abstractNumId w:val="8"/>
   </w:num>
-  <w:num w:numId="9">
+  <w:num w:numId="9" w16cid:durableId="717361386">
     <w:abstractNumId w:val="0"/>
   </w:num>
-  <w:num w:numId="10">
+  <w:num w:numId="10" w16cid:durableId="485628185">
     <w:abstractNumId w:val="5"/>
   </w:num>
-  <w:num w:numId="11">
+  <w:num w:numId="11" w16cid:durableId="107505649">
     <w:abstractNumId w:val="12"/>
   </w:num>
-  <w:num w:numId="12">
+  <w:num w:numId="12" w16cid:durableId="2104521691">
     <w:abstractNumId w:val="9"/>
   </w:num>
-  <w:num w:numId="13">
+  <w:num w:numId="13" w16cid:durableId="975767649">
     <w:abstractNumId w:val="6"/>
   </w:num>
-  <w:num w:numId="14">
+  <w:num w:numId="14" w16cid:durableId="1667124967">
     <w:abstractNumId w:val="11"/>
   </w:num>
-  <w:num w:numId="15">
+  <w:num w:numId="15" w16cid:durableId="1321733180">
     <w:abstractNumId w:val="13"/>
   </w:num>
-  <w:num w:numId="16">
+  <w:num w:numId="16" w16cid:durableId="837622529">
     <w:abstractNumId w:val="3"/>
   </w:num>
 </w:numbering>
 </file>
 
 <file path=word/styles.xml><?xml version="1.0" encoding="utf-8"?>
-<w:styles xmlns:mc="http://schemas.openxmlformats.org/markup-compatibility/2006" xmlns:r="http://schemas.openxmlformats.org/officeDocument/2006/relationships" xmlns:w="http://schemas.openxmlformats.org/wordprocessingml/2006/main" xmlns:w14="http://schemas.microsoft.com/office/word/2010/wordml" xmlns:w15="http://schemas.microsoft.com/office/word/2012/wordml" xmlns:w16se="http://schemas.microsoft.com/office/word/2015/wordml/symex" mc:Ignorable="w14 w15 w16se">
+<w:styles xmlns:mc="http://schemas.openxmlformats.org/markup-compatibility/2006" xmlns:r="http://schemas.openxmlformats.org/officeDocument/2006/relationships" xmlns:w="http://schemas.openxmlformats.org/wordprocessingml/2006/main" xmlns:w14="http://schemas.microsoft.com/office/word/2010/wordml" xmlns:w15="http://schemas.microsoft.com/office/word/2012/wordml" xmlns:w16cex="http://schemas.microsoft.com/office/word/2018/wordml/cex" xmlns:w16cid="http://schemas.microsoft.com/office/word/2016/wordml/cid" xmlns:w16="http://schemas.microsoft.com/office/word/2018/wordml" xmlns:w16du="http://schemas.microsoft.com/office/word/2023/wordml/word16du" xmlns:w16sdtdh="http://schemas.microsoft.com/office/word/2020/wordml/sdtdatahash" xmlns:w16sdtfl="http://schemas.microsoft.com/office/word/2024/wordml/sdtformatlock" xmlns:w16se="http://schemas.microsoft.com/office/word/2015/wordml/symex" mc:Ignorable="w14 w15 w16se w16cid w16 w16cex w16sdtdh w16sdtfl w16du">
   <w:docDefaults>
     <w:rPrDefault>
       <w:rPr>
-        <w:rFonts w:ascii="Arial" w:hAnsi="Arial" w:eastAsia="Calibri" w:cs="Arial"/>
+        <w:rFonts w:ascii="Arial" w:eastAsia="Calibri" w:hAnsi="Arial" w:cs="Arial"/>
         <w:color w:val="000000"/>
         <w:szCs w:val="22"/>
         <w:lang w:val="en-GB" w:eastAsia="en-GB" w:bidi="ar-SA"/>
@@ -4678,17 +4237,17 @@
     </w:rPrDefault>
     <w:pPrDefault/>
   </w:docDefaults>
-  <w:latentStyles w:defLockedState="0" w:defUIPriority="99" w:defSemiHidden="0" w:defUnhideWhenUsed="0" w:defQFormat="0" w:count="371">
+  <w:latentStyles w:defLockedState="0" w:defUIPriority="99" w:defSemiHidden="0" w:defUnhideWhenUsed="0" w:defQFormat="0" w:count="376">
     <w:lsdException w:name="Normal" w:uiPriority="0" w:qFormat="1"/>
     <w:lsdException w:name="heading 1" w:uiPriority="9" w:qFormat="1"/>
-    <w:lsdException w:name="heading 2" w:uiPriority="9" w:semiHidden="1" w:unhideWhenUsed="1" w:qFormat="1"/>
-    <w:lsdException w:name="heading 3" w:uiPriority="9" w:semiHidden="1" w:unhideWhenUsed="1" w:qFormat="1"/>
-    <w:lsdException w:name="heading 4" w:uiPriority="9" w:semiHidden="1" w:unhideWhenUsed="1" w:qFormat="1"/>
-    <w:lsdException w:name="heading 5" w:uiPriority="9" w:semiHidden="1" w:unhideWhenUsed="1" w:qFormat="1"/>
-    <w:lsdException w:name="heading 6" w:uiPriority="9" w:semiHidden="1" w:unhideWhenUsed="1" w:qFormat="1"/>
-    <w:lsdException w:name="heading 7" w:uiPriority="9" w:semiHidden="1" w:unhideWhenUsed="1" w:qFormat="1"/>
-    <w:lsdException w:name="heading 8" w:uiPriority="9" w:semiHidden="1" w:unhideWhenUsed="1" w:qFormat="1"/>
-    <w:lsdException w:name="heading 9" w:uiPriority="9" w:semiHidden="1" w:unhideWhenUsed="1" w:qFormat="1"/>
+    <w:lsdException w:name="heading 2" w:semiHidden="1" w:uiPriority="9" w:unhideWhenUsed="1" w:qFormat="1"/>
+    <w:lsdException w:name="heading 3" w:semiHidden="1" w:uiPriority="9" w:unhideWhenUsed="1" w:qFormat="1"/>
+    <w:lsdException w:name="heading 4" w:semiHidden="1" w:uiPriority="9" w:unhideWhenUsed="1" w:qFormat="1"/>
+    <w:lsdException w:name="heading 5" w:semiHidden="1" w:uiPriority="9" w:unhideWhenUsed="1" w:qFormat="1"/>
+    <w:lsdException w:name="heading 6" w:semiHidden="1" w:uiPriority="9" w:unhideWhenUsed="1" w:qFormat="1"/>
+    <w:lsdException w:name="heading 7" w:semiHidden="1" w:uiPriority="9" w:unhideWhenUsed="1" w:qFormat="1"/>
+    <w:lsdException w:name="heading 8" w:semiHidden="1" w:uiPriority="9" w:unhideWhenUsed="1" w:qFormat="1"/>
+    <w:lsdException w:name="heading 9" w:semiHidden="1" w:uiPriority="9" w:unhideWhenUsed="1" w:qFormat="1"/>
     <w:lsdException w:name="index 1" w:semiHidden="1" w:unhideWhenUsed="1"/>
     <w:lsdException w:name="index 2" w:semiHidden="1" w:unhideWhenUsed="1"/>
     <w:lsdException w:name="index 3" w:semiHidden="1" w:unhideWhenUsed="1"/>
@@ -4698,22 +4257,22 @@
     <w:lsdException w:name="index 7" w:semiHidden="1" w:unhideWhenUsed="1"/>
     <w:lsdException w:name="index 8" w:semiHidden="1" w:unhideWhenUsed="1"/>
     <w:lsdException w:name="index 9" w:semiHidden="1" w:unhideWhenUsed="1"/>
-    <w:lsdException w:name="toc 1" w:uiPriority="39" w:semiHidden="1" w:unhideWhenUsed="1"/>
-    <w:lsdException w:name="toc 2" w:uiPriority="39" w:semiHidden="1" w:unhideWhenUsed="1"/>
-    <w:lsdException w:name="toc 3" w:uiPriority="39" w:semiHidden="1" w:unhideWhenUsed="1"/>
-    <w:lsdException w:name="toc 4" w:uiPriority="39" w:semiHidden="1" w:unhideWhenUsed="1"/>
-    <w:lsdException w:name="toc 5" w:uiPriority="39" w:semiHidden="1" w:unhideWhenUsed="1"/>
-    <w:lsdException w:name="toc 6" w:uiPriority="39" w:semiHidden="1" w:unhideWhenUsed="1"/>
-    <w:lsdException w:name="toc 7" w:uiPriority="39" w:semiHidden="1" w:unhideWhenUsed="1"/>
-    <w:lsdException w:name="toc 8" w:uiPriority="39" w:semiHidden="1" w:unhideWhenUsed="1"/>
-    <w:lsdException w:name="toc 9" w:uiPriority="39" w:semiHidden="1" w:unhideWhenUsed="1"/>
+    <w:lsdException w:name="toc 1" w:semiHidden="1" w:uiPriority="39" w:unhideWhenUsed="1"/>
+    <w:lsdException w:name="toc 2" w:semiHidden="1" w:uiPriority="39" w:unhideWhenUsed="1"/>
+    <w:lsdException w:name="toc 3" w:semiHidden="1" w:uiPriority="39" w:unhideWhenUsed="1"/>
+    <w:lsdException w:name="toc 4" w:semiHidden="1" w:uiPriority="39" w:unhideWhenUsed="1"/>
+    <w:lsdException w:name="toc 5" w:semiHidden="1" w:uiPriority="39" w:unhideWhenUsed="1"/>
+    <w:lsdException w:name="toc 6" w:semiHidden="1" w:uiPriority="39" w:unhideWhenUsed="1"/>
+    <w:lsdException w:name="toc 7" w:semiHidden="1" w:uiPriority="39" w:unhideWhenUsed="1"/>
+    <w:lsdException w:name="toc 8" w:semiHidden="1" w:uiPriority="39" w:unhideWhenUsed="1"/>
+    <w:lsdException w:name="toc 9" w:semiHidden="1" w:uiPriority="39" w:unhideWhenUsed="1"/>
     <w:lsdException w:name="Normal Indent" w:semiHidden="1" w:unhideWhenUsed="1"/>
     <w:lsdException w:name="footnote text" w:semiHidden="1" w:unhideWhenUsed="1"/>
     <w:lsdException w:name="annotation text" w:semiHidden="1" w:unhideWhenUsed="1"/>
     <w:lsdException w:name="header" w:semiHidden="1" w:unhideWhenUsed="1"/>
     <w:lsdException w:name="footer" w:semiHidden="1" w:unhideWhenUsed="1"/>
     <w:lsdException w:name="index heading" w:semiHidden="1" w:unhideWhenUsed="1"/>
-    <w:lsdException w:name="caption" w:uiPriority="35" w:semiHidden="1" w:unhideWhenUsed="1" w:qFormat="1"/>
+    <w:lsdException w:name="caption" w:semiHidden="1" w:uiPriority="35" w:unhideWhenUsed="1" w:qFormat="1"/>
     <w:lsdException w:name="table of figures" w:semiHidden="1" w:unhideWhenUsed="1"/>
     <w:lsdException w:name="envelope address" w:semiHidden="1" w:unhideWhenUsed="1"/>
     <w:lsdException w:name="envelope return" w:semiHidden="1" w:unhideWhenUsed="1"/>
@@ -4744,7 +4303,7 @@
     <w:lsdException w:name="Title" w:uiPriority="10" w:qFormat="1"/>
     <w:lsdException w:name="Closing" w:semiHidden="1" w:unhideWhenUsed="1"/>
     <w:lsdException w:name="Signature" w:semiHidden="1" w:unhideWhenUsed="1"/>
-    <w:lsdException w:name="Default Paragraph Font" w:uiPriority="1" w:semiHidden="1" w:unhideWhenUsed="1"/>
+    <w:lsdException w:name="Default Paragraph Font" w:semiHidden="1" w:uiPriority="1" w:unhideWhenUsed="1"/>
     <w:lsdException w:name="Body Text" w:semiHidden="1" w:unhideWhenUsed="1"/>
     <w:lsdException w:name="Body Text Indent" w:semiHidden="1" w:unhideWhenUsed="1"/>
     <w:lsdException w:name="List Continue" w:semiHidden="1" w:unhideWhenUsed="1"/>
@@ -4944,8 +4503,8 @@
     <w:lsdException w:name="Subtle Reference" w:uiPriority="31" w:qFormat="1"/>
     <w:lsdException w:name="Intense Reference" w:uiPriority="32" w:qFormat="1"/>
     <w:lsdException w:name="Book Title" w:uiPriority="33" w:qFormat="1"/>
-    <w:lsdException w:name="Bibliography" w:uiPriority="37" w:semiHidden="1" w:unhideWhenUsed="1"/>
-    <w:lsdException w:name="TOC Heading" w:uiPriority="39" w:semiHidden="1" w:unhideWhenUsed="1" w:qFormat="1"/>
+    <w:lsdException w:name="Bibliography" w:semiHidden="1" w:uiPriority="37" w:unhideWhenUsed="1"/>
+    <w:lsdException w:name="TOC Heading" w:semiHidden="1" w:uiPriority="39" w:unhideWhenUsed="1" w:qFormat="1"/>
     <w:lsdException w:name="Grid Table 4" w:uiPriority="49"/>
     <w:lsdException w:name="Grid Table 5 Dark" w:uiPriority="50"/>
     <w:lsdException w:name="Grid Table 6 Colorful" w:uiPriority="51"/>
@@ -5041,21 +4600,26 @@
     <w:lsdException w:name="List Table 5 Dark Accent 6" w:uiPriority="50"/>
     <w:lsdException w:name="List Table 6 Colorful Accent 6" w:uiPriority="51"/>
     <w:lsdException w:name="List Table 7 Colorful Accent 6" w:uiPriority="52"/>
+    <w:lsdException w:name="Mention" w:semiHidden="1" w:unhideWhenUsed="1"/>
+    <w:lsdException w:name="Smart Hyperlink" w:semiHidden="1" w:unhideWhenUsed="1"/>
+    <w:lsdException w:name="Hashtag" w:semiHidden="1" w:unhideWhenUsed="1"/>
+    <w:lsdException w:name="Unresolved Mention" w:semiHidden="1" w:unhideWhenUsed="1"/>
+    <w:lsdException w:name="Smart Link" w:semiHidden="1" w:unhideWhenUsed="1"/>
   </w:latentStyles>
-  <w:style w:type="paragraph" w:styleId="Normal" w:default="1">
+  <w:style w:type="paragraph" w:default="1" w:styleId="Normal">
     <w:name w:val="Normal"/>
     <w:qFormat/>
     <w:pPr>
       <w:spacing w:after="200" w:line="276" w:lineRule="auto"/>
     </w:pPr>
   </w:style>
-  <w:style w:type="character" w:styleId="DefaultParagraphFont" w:default="1">
+  <w:style w:type="character" w:default="1" w:styleId="DefaultParagraphFont">
     <w:name w:val="Default Paragraph Font"/>
     <w:uiPriority w:val="1"/>
     <w:semiHidden/>
     <w:unhideWhenUsed/>
   </w:style>
-  <w:style w:type="table" w:styleId="TableNormal" w:default="1">
+  <w:style w:type="table" w:default="1" w:styleId="TableNormal">
     <w:name w:val="Normal Table"/>
     <w:uiPriority w:val="99"/>
     <w:semiHidden/>
@@ -5070,7 +4634,7 @@
       </w:tblCellMar>
     </w:tblPr>
   </w:style>
-  <w:style w:type="numbering" w:styleId="NoList" w:default="1">
+  <w:style w:type="numbering" w:default="1" w:styleId="NoList">
     <w:name w:val="No List"/>
     <w:uiPriority w:val="99"/>
     <w:semiHidden/>
@@ -5091,7 +4655,7 @@
       <w:spacing w:after="0" w:line="240" w:lineRule="auto"/>
     </w:pPr>
   </w:style>
-  <w:style w:type="character" w:styleId="HeaderChar" w:customStyle="1">
+  <w:style w:type="character" w:customStyle="1" w:styleId="HeaderChar">
     <w:name w:val="Header Char"/>
     <w:basedOn w:val="DefaultParagraphFont"/>
     <w:link w:val="Header"/>
@@ -5113,14 +4677,14 @@
       <w:spacing w:after="0" w:line="240" w:lineRule="auto"/>
     </w:pPr>
   </w:style>
-  <w:style w:type="character" w:styleId="FooterChar" w:customStyle="1">
+  <w:style w:type="character" w:customStyle="1" w:styleId="FooterChar">
     <w:name w:val="Footer Char"/>
     <w:basedOn w:val="DefaultParagraphFont"/>
     <w:link w:val="Footer"/>
     <w:uiPriority w:val="99"/>
     <w:rsid w:val="00F5220C"/>
   </w:style>
-  <w:style w:type="paragraph" w:styleId="charity" w:customStyle="1">
+  <w:style w:type="paragraph" w:customStyle="1" w:styleId="charity">
     <w:name w:val="charity"/>
     <w:basedOn w:val="Normal"/>
     <w:rsid w:val="00EB2C86"/>
@@ -5129,7 +4693,7 @@
       <w:ind w:left="450"/>
     </w:pPr>
     <w:rPr>
-      <w:rFonts w:ascii="Times New Roman" w:hAnsi="Times New Roman" w:eastAsia="Times New Roman"/>
+      <w:rFonts w:ascii="Times New Roman" w:eastAsia="Times New Roman" w:hAnsi="Times New Roman"/>
       <w:color w:val="999999"/>
       <w:szCs w:val="20"/>
     </w:rPr>
@@ -5173,7 +4737,7 @@
       <w:szCs w:val="16"/>
     </w:rPr>
   </w:style>
-  <w:style w:type="character" w:styleId="BalloonTextChar" w:customStyle="1">
+  <w:style w:type="character" w:customStyle="1" w:styleId="BalloonTextChar">
     <w:name w:val="Balloon Text Char"/>
     <w:basedOn w:val="DefaultParagraphFont"/>
     <w:link w:val="BalloonText"/>
@@ -5193,12 +4757,12 @@
     <w:rsid w:val="009742ED"/>
     <w:tblPr>
       <w:tblBorders>
-        <w:top w:val="single" w:color="auto" w:sz="4" w:space="0"/>
-        <w:left w:val="single" w:color="auto" w:sz="4" w:space="0"/>
-        <w:bottom w:val="single" w:color="auto" w:sz="4" w:space="0"/>
-        <w:right w:val="single" w:color="auto" w:sz="4" w:space="0"/>
-        <w:insideH w:val="single" w:color="auto" w:sz="4" w:space="0"/>
-        <w:insideV w:val="single" w:color="auto" w:sz="4" w:space="0"/>
+        <w:top w:val="single" w:sz="4" w:space="0" w:color="auto"/>
+        <w:left w:val="single" w:sz="4" w:space="0" w:color="auto"/>
+        <w:bottom w:val="single" w:sz="4" w:space="0" w:color="auto"/>
+        <w:right w:val="single" w:sz="4" w:space="0" w:color="auto"/>
+        <w:insideH w:val="single" w:sz="4" w:space="0" w:color="auto"/>
+        <w:insideV w:val="single" w:sz="4" w:space="0" w:color="auto"/>
       </w:tblBorders>
     </w:tblPr>
   </w:style>
@@ -5217,7 +4781,7 @@
       <w:szCs w:val="20"/>
     </w:rPr>
   </w:style>
-  <w:style w:type="character" w:styleId="FootnoteTextChar" w:customStyle="1">
+  <w:style w:type="character" w:customStyle="1" w:styleId="FootnoteTextChar">
     <w:name w:val="Footnote Text Char"/>
     <w:basedOn w:val="DefaultParagraphFont"/>
     <w:link w:val="FootnoteText"/>
@@ -5249,7 +4813,7 @@
       <w:spacing w:before="100" w:beforeAutospacing="1" w:after="100" w:afterAutospacing="1" w:line="240" w:lineRule="auto"/>
     </w:pPr>
     <w:rPr>
-      <w:rFonts w:ascii="Times New Roman" w:hAnsi="Times New Roman" w:eastAsia="Times New Roman" w:cs="Times New Roman"/>
+      <w:rFonts w:ascii="Times New Roman" w:eastAsia="Times New Roman" w:hAnsi="Times New Roman" w:cs="Times New Roman"/>
       <w:color w:val="auto"/>
       <w:sz w:val="24"/>
       <w:szCs w:val="24"/>
@@ -5294,7 +4858,7 @@
       <w:szCs w:val="20"/>
     </w:rPr>
   </w:style>
-  <w:style w:type="character" w:styleId="CommentTextChar" w:customStyle="1">
+  <w:style w:type="character" w:customStyle="1" w:styleId="CommentTextChar">
     <w:name w:val="Comment Text Char"/>
     <w:basedOn w:val="DefaultParagraphFont"/>
     <w:link w:val="CommentText"/>
@@ -5319,7 +4883,7 @@
       <w:bCs/>
     </w:rPr>
   </w:style>
-  <w:style w:type="character" w:styleId="CommentSubjectChar" w:customStyle="1">
+  <w:style w:type="character" w:customStyle="1" w:styleId="CommentSubjectChar">
     <w:name w:val="Comment Subject Char"/>
     <w:basedOn w:val="CommentTextChar"/>
     <w:link w:val="CommentSubject"/>
@@ -5332,8 +4896,8 @@
       <w:szCs w:val="20"/>
     </w:rPr>
   </w:style>
-  <w:style w:type="character" w:styleId="UnresolvedMention" w:customStyle="1">
-    <w:name w:val="Unresolved Mention"/>
+  <w:style w:type="character" w:customStyle="1" w:styleId="UnresolvedMention1">
+    <w:name w:val="Unresolved Mention1"/>
     <w:basedOn w:val="DefaultParagraphFont"/>
     <w:uiPriority w:val="99"/>
     <w:semiHidden/>
@@ -5633,21 +5197,10 @@
 </file>
 
 <file path=customXml/item1.xml><?xml version="1.0" encoding="utf-8"?>
-<p:properties xmlns:p="http://schemas.microsoft.com/office/2006/metadata/properties" xmlns:xsi="http://www.w3.org/2001/XMLSchema-instance" xmlns:pc="http://schemas.microsoft.com/office/infopath/2007/PartnerControls">
-  <documentManagement/>
-</p:properties>
+<b:Sources xmlns:b="http://schemas.openxmlformats.org/officeDocument/2006/bibliography" xmlns="http://schemas.openxmlformats.org/officeDocument/2006/bibliography" SelectedStyle="\APA.XSL" StyleName="APA"/>
 </file>
 
 <file path=customXml/item2.xml><?xml version="1.0" encoding="utf-8"?>
-<?mso-contentType ?>
-<FormTemplates xmlns="http://schemas.microsoft.com/sharepoint/v3/contenttype/forms">
-  <Display>DocumentLibraryForm</Display>
-  <Edit>DocumentLibraryForm</Edit>
-  <New>DocumentLibraryForm</New>
-</FormTemplates>
-</file>
-
-<file path=customXml/item3.xml><?xml version="1.0" encoding="utf-8"?>
 <ct:contentTypeSchema xmlns:ct="http://schemas.microsoft.com/office/2006/metadata/contentType" xmlns:ma="http://schemas.microsoft.com/office/2006/metadata/properties/metaAttributes" ct:_="" ma:_="" ma:contentTypeName="Document" ma:contentTypeID="0x01010003331050ADEE4545834989066FBCAF18" ma:contentTypeVersion="10" ma:contentTypeDescription="Create a new document." ma:contentTypeScope="" ma:versionID="c5ff977d6f611753f8ff4058f45a3a08">
   <xsd:schema xmlns:xsd="http://www.w3.org/2001/XMLSchema" xmlns:xs="http://www.w3.org/2001/XMLSchema" xmlns:p="http://schemas.microsoft.com/office/2006/metadata/properties" xmlns:ns2="c21afd64-1761-426e-bbcc-3f979c02d595" xmlns:ns3="baf7add7-e9c6-4ff6-9212-8b6db818cbf7" targetNamespace="http://schemas.microsoft.com/office/2006/metadata/properties" ma:root="true" ma:fieldsID="484f34c621cb1f4b2d216e857a8e8b52" ns2:_="" ns3:_="">
     <xsd:import namespace="c21afd64-1761-426e-bbcc-3f979c02d595"/>
@@ -5838,191 +5391,38 @@
 </ct:contentTypeSchema>
 </file>
 
-<file path=customXml/item4.xml><?xml version="1.0" encoding="utf-8"?>
-<ct:contentTypeSchema xmlns:ct="http://schemas.microsoft.com/office/2006/metadata/contentType" xmlns:ma="http://schemas.microsoft.com/office/2006/metadata/properties/metaAttributes" ct:_="" ma:_="" ma:contentTypeName="Document" ma:contentTypeID="0x01010009CAD94541FC744B8525AAD68F3BDAA2" ma:contentTypeVersion="0" ma:contentTypeDescription="Create a new document." ma:contentTypeScope="" ma:versionID="027382cd06b1da7f704838252ce3e793">
-  <xsd:schema xmlns:xsd="http://www.w3.org/2001/XMLSchema" xmlns:xs="http://www.w3.org/2001/XMLSchema" xmlns:p="http://schemas.microsoft.com/office/2006/metadata/properties" xmlns:ns2="d0cf8aa7-2854-4057-860d-6b146d200eb6" targetNamespace="http://schemas.microsoft.com/office/2006/metadata/properties" ma:root="true" ma:fieldsID="9d3dd638d84888565cf8f2bfecb99d35" ns2:_="">
-    <xsd:import namespace="d0cf8aa7-2854-4057-860d-6b146d200eb6"/>
-    <xsd:element name="properties">
-      <xsd:complexType>
-        <xsd:sequence>
-          <xsd:element name="documentManagement">
-            <xsd:complexType>
-              <xsd:all>
-                <xsd:element ref="ns2:_dlc_DocId" minOccurs="0"/>
-                <xsd:element ref="ns2:_dlc_DocIdUrl" minOccurs="0"/>
-                <xsd:element ref="ns2:_dlc_DocIdPersistId" minOccurs="0"/>
-              </xsd:all>
-            </xsd:complexType>
-          </xsd:element>
-        </xsd:sequence>
-      </xsd:complexType>
-    </xsd:element>
-  </xsd:schema>
-  <xsd:schema xmlns:xsd="http://www.w3.org/2001/XMLSchema" xmlns:xs="http://www.w3.org/2001/XMLSchema" xmlns:dms="http://schemas.microsoft.com/office/2006/documentManagement/types" xmlns:pc="http://schemas.microsoft.com/office/infopath/2007/PartnerControls" targetNamespace="d0cf8aa7-2854-4057-860d-6b146d200eb6" elementFormDefault="qualified">
-    <xsd:import namespace="http://schemas.microsoft.com/office/2006/documentManagement/types"/>
-    <xsd:import namespace="http://schemas.microsoft.com/office/infopath/2007/PartnerControls"/>
-    <xsd:element name="_dlc_DocId" ma:index="8" nillable="true" ma:displayName="Document ID Value" ma:description="The value of the document ID assigned to this item." ma:internalName="_dlc_DocId" ma:readOnly="true">
-      <xsd:simpleType>
-        <xsd:restriction base="dms:Text"/>
-      </xsd:simpleType>
-    </xsd:element>
-    <xsd:element name="_dlc_DocIdUrl" ma:index="9" nillable="true" ma:displayName="Document ID" ma:description="Permanent link to this document." ma:hidden="true" ma:internalName="_dlc_DocIdUrl" ma:readOnly="true">
-      <xsd:complexType>
-        <xsd:complexContent>
-          <xsd:extension base="dms:URL">
-            <xsd:sequence>
-              <xsd:element name="Url" type="dms:ValidUrl" minOccurs="0" nillable="true"/>
-              <xsd:element name="Description" type="xsd:string" nillable="true"/>
-            </xsd:sequence>
-          </xsd:extension>
-        </xsd:complexContent>
-      </xsd:complexType>
-    </xsd:element>
-    <xsd:element name="_dlc_DocIdPersistId" ma:index="10" nillable="true" ma:displayName="Persist ID" ma:description="Keep ID on add." ma:hidden="true" ma:internalName="_dlc_DocIdPersistId" ma:readOnly="true">
-      <xsd:simpleType>
-        <xsd:restriction base="dms:Boolean"/>
-      </xsd:simpleType>
-    </xsd:element>
-  </xsd:schema>
-  <xsd:schema xmlns="http://schemas.openxmlformats.org/package/2006/metadata/core-properties" xmlns:xsd="http://www.w3.org/2001/XMLSchema" xmlns:xsi="http://www.w3.org/2001/XMLSchema-instance" xmlns:dc="http://purl.org/dc/elements/1.1/" xmlns:dcterms="http://purl.org/dc/terms/" xmlns:odoc="http://schemas.microsoft.com/internal/obd" targetNamespace="http://schemas.openxmlformats.org/package/2006/metadata/core-properties" elementFormDefault="qualified" attributeFormDefault="unqualified" blockDefault="#all">
-    <xsd:import namespace="http://purl.org/dc/elements/1.1/" schemaLocation="http://dublincore.org/schemas/xmls/qdc/2003/04/02/dc.xsd"/>
-    <xsd:import namespace="http://purl.org/dc/terms/" schemaLocation="http://dublincore.org/schemas/xmls/qdc/2003/04/02/dcterms.xsd"/>
-    <xsd:element name="coreProperties" type="CT_coreProperties"/>
-    <xsd:complexType name="CT_coreProperties">
-      <xsd:all>
-        <xsd:element ref="dc:creator" minOccurs="0" maxOccurs="1"/>
-        <xsd:element ref="dcterms:created" minOccurs="0" maxOccurs="1"/>
-        <xsd:element ref="dc:identifier" minOccurs="0" maxOccurs="1"/>
-        <xsd:element name="contentType" minOccurs="0" maxOccurs="1" type="xsd:string" ma:index="0" ma:displayName="Content Type"/>
-        <xsd:element ref="dc:title" maxOccurs="1" ma:index="4" ma:displayName="Title"/>
-        <xsd:element ref="dc:subject" minOccurs="0" maxOccurs="1"/>
-        <xsd:element ref="dc:description" minOccurs="0" maxOccurs="1"/>
-        <xsd:element name="keywords" minOccurs="0" maxOccurs="1" type="xsd:string"/>
-        <xsd:element ref="dc:language" minOccurs="0" maxOccurs="1"/>
-        <xsd:element name="category" minOccurs="0" maxOccurs="1" type="xsd:string"/>
-        <xsd:element name="version" minOccurs="0" maxOccurs="1" type="xsd:string"/>
-        <xsd:element name="revision" minOccurs="0" maxOccurs="1" type="xsd:string">
-          <xsd:annotation>
-            <xsd:documentation>
-                        This value indicates the number of saves or revisions. The application is responsible for updating this value after each revision.
-                    </xsd:documentation>
-          </xsd:annotation>
-        </xsd:element>
-        <xsd:element name="lastModifiedBy" minOccurs="0" maxOccurs="1" type="xsd:string"/>
-        <xsd:element ref="dcterms:modified" minOccurs="0" maxOccurs="1"/>
-        <xsd:element name="contentStatus" minOccurs="0" maxOccurs="1" type="xsd:string"/>
-      </xsd:all>
-    </xsd:complexType>
-  </xsd:schema>
-  <xs:schema xmlns:pc="http://schemas.microsoft.com/office/infopath/2007/PartnerControls" xmlns:xs="http://www.w3.org/2001/XMLSchema" targetNamespace="http://schemas.microsoft.com/office/infopath/2007/PartnerControls" elementFormDefault="qualified" attributeFormDefault="unqualified">
-    <xs:element name="Person">
-      <xs:complexType>
-        <xs:sequence>
-          <xs:element ref="pc:DisplayName" minOccurs="0"/>
-          <xs:element ref="pc:AccountId" minOccurs="0"/>
-          <xs:element ref="pc:AccountType" minOccurs="0"/>
-        </xs:sequence>
-      </xs:complexType>
-    </xs:element>
-    <xs:element name="DisplayName" type="xs:string"/>
-    <xs:element name="AccountId" type="xs:string"/>
-    <xs:element name="AccountType" type="xs:string"/>
-    <xs:element name="BDCAssociatedEntity">
-      <xs:complexType>
-        <xs:sequence>
-          <xs:element ref="pc:BDCEntity" minOccurs="0" maxOccurs="unbounded"/>
-        </xs:sequence>
-        <xs:attribute ref="pc:EntityNamespace"/>
-        <xs:attribute ref="pc:EntityName"/>
-        <xs:attribute ref="pc:SystemInstanceName"/>
-        <xs:attribute ref="pc:AssociationName"/>
-      </xs:complexType>
-    </xs:element>
-    <xs:attribute name="EntityNamespace" type="xs:string"/>
-    <xs:attribute name="EntityName" type="xs:string"/>
-    <xs:attribute name="SystemInstanceName" type="xs:string"/>
-    <xs:attribute name="AssociationName" type="xs:string"/>
-    <xs:element name="BDCEntity">
-      <xs:complexType>
-        <xs:sequence>
-          <xs:element ref="pc:EntityDisplayName" minOccurs="0"/>
-          <xs:element ref="pc:EntityInstanceReference" minOccurs="0"/>
-          <xs:element ref="pc:EntityId1" minOccurs="0"/>
-          <xs:element ref="pc:EntityId2" minOccurs="0"/>
-          <xs:element ref="pc:EntityId3" minOccurs="0"/>
-          <xs:element ref="pc:EntityId4" minOccurs="0"/>
-          <xs:element ref="pc:EntityId5" minOccurs="0"/>
-        </xs:sequence>
-      </xs:complexType>
-    </xs:element>
-    <xs:element name="EntityDisplayName" type="xs:string"/>
-    <xs:element name="EntityInstanceReference" type="xs:string"/>
-    <xs:element name="EntityId1" type="xs:string"/>
-    <xs:element name="EntityId2" type="xs:string"/>
-    <xs:element name="EntityId3" type="xs:string"/>
-    <xs:element name="EntityId4" type="xs:string"/>
-    <xs:element name="EntityId5" type="xs:string"/>
-    <xs:element name="Terms">
-      <xs:complexType>
-        <xs:sequence>
-          <xs:element ref="pc:TermInfo" minOccurs="0" maxOccurs="unbounded"/>
-        </xs:sequence>
-      </xs:complexType>
-    </xs:element>
-    <xs:element name="TermInfo">
-      <xs:complexType>
-        <xs:sequence>
-          <xs:element ref="pc:TermName" minOccurs="0"/>
-          <xs:element ref="pc:TermId" minOccurs="0"/>
-        </xs:sequence>
-      </xs:complexType>
-    </xs:element>
-    <xs:element name="TermName" type="xs:string"/>
-    <xs:element name="TermId" type="xs:string"/>
-  </xs:schema>
-</ct:contentTypeSchema>
+<file path=customXml/item3.xml><?xml version="1.0" encoding="utf-8"?>
+<?mso-contentType ?>
+<FormTemplates xmlns="http://schemas.microsoft.com/sharepoint/v3/contenttype/forms">
+  <Display>DocumentLibraryForm</Display>
+  <Edit>DocumentLibraryForm</Edit>
+  <New>DocumentLibraryForm</New>
+</FormTemplates>
 </file>
 
-<file path=customXml/item5.xml><?xml version="1.0" encoding="utf-8"?>
-<b:Sources xmlns:b="http://schemas.openxmlformats.org/officeDocument/2006/bibliography" xmlns="http://schemas.openxmlformats.org/officeDocument/2006/bibliography" SelectedStyle="\APA.XSL" StyleName="APA"/>
+<file path=customXml/item4.xml><?xml version="1.0" encoding="utf-8"?>
+<p:properties xmlns:p="http://schemas.microsoft.com/office/2006/metadata/properties" xmlns:xsi="http://www.w3.org/2001/XMLSchema-instance" xmlns:pc="http://schemas.microsoft.com/office/infopath/2007/PartnerControls">
+  <documentManagement/>
+</p:properties>
 </file>
 
 <file path=customXml/itemProps1.xml><?xml version="1.0" encoding="utf-8"?>
-<ds:datastoreItem xmlns:ds="http://schemas.openxmlformats.org/officeDocument/2006/customXml" ds:itemID="{60ADE598-3079-4E2D-A7F9-CBBBAA8F5365}">
+<ds:datastoreItem xmlns:ds="http://schemas.openxmlformats.org/officeDocument/2006/customXml" ds:itemID="{3BF6FE77-DB13-4F8E-B262-35BDB1D68E81}">
   <ds:schemaRefs>
-    <ds:schemaRef ds:uri="http://purl.org/dc/terms/"/>
-    <ds:schemaRef ds:uri="http://schemas.microsoft.com/office/infopath/2007/PartnerControls"/>
-    <ds:schemaRef ds:uri="http://schemas.openxmlformats.org/package/2006/metadata/core-properties"/>
-    <ds:schemaRef ds:uri="http://schemas.microsoft.com/office/2006/documentManagement/types"/>
-    <ds:schemaRef ds:uri="http://purl.org/dc/elements/1.1/"/>
-    <ds:schemaRef ds:uri="d0cf8aa7-2854-4057-860d-6b146d200eb6"/>
-    <ds:schemaRef ds:uri="http://schemas.microsoft.com/office/2006/metadata/properties"/>
-    <ds:schemaRef ds:uri="http://www.w3.org/XML/1998/namespace"/>
-    <ds:schemaRef ds:uri="http://purl.org/dc/dcmitype/"/>
+    <ds:schemaRef ds:uri="http://schemas.openxmlformats.org/officeDocument/2006/bibliography"/>
   </ds:schemaRefs>
 </ds:datastoreItem>
 </file>
 
 <file path=customXml/itemProps2.xml><?xml version="1.0" encoding="utf-8"?>
-<ds:datastoreItem xmlns:ds="http://schemas.openxmlformats.org/officeDocument/2006/customXml" ds:itemID="{9ABEDCF3-9ECC-4930-B573-01A6A0B99AF4}">
-  <ds:schemaRefs>
-    <ds:schemaRef ds:uri="http://schemas.microsoft.com/sharepoint/v3/contenttype/forms"/>
-  </ds:schemaRefs>
-</ds:datastoreItem>
-</file>
-
-<file path=customXml/itemProps3.xml><?xml version="1.0" encoding="utf-8"?>
-<ds:datastoreItem xmlns:ds="http://schemas.openxmlformats.org/officeDocument/2006/customXml" ds:itemID="{ADD48BE3-1477-4C13-A6EC-FA559F2FA9B6}"/>
-</file>
-
-<file path=customXml/itemProps4.xml><?xml version="1.0" encoding="utf-8"?>
-<ds:datastoreItem xmlns:ds="http://schemas.openxmlformats.org/officeDocument/2006/customXml" ds:itemID="{AF7542EC-38C4-490E-A9B5-10E3B7020778}">
+<ds:datastoreItem xmlns:ds="http://schemas.openxmlformats.org/officeDocument/2006/customXml" ds:itemID="{ADD48BE3-1477-4C13-A6EC-FA559F2FA9B6}">
   <ds:schemaRefs>
     <ds:schemaRef ds:uri="http://schemas.microsoft.com/office/2006/metadata/contentType"/>
     <ds:schemaRef ds:uri="http://schemas.microsoft.com/office/2006/metadata/properties/metaAttributes"/>
     <ds:schemaRef ds:uri="http://www.w3.org/2001/XMLSchema"/>
     <ds:schemaRef ds:uri="http://schemas.microsoft.com/office/2006/metadata/properties"/>
-    <ds:schemaRef ds:uri="d0cf8aa7-2854-4057-860d-6b146d200eb6"/>
+    <ds:schemaRef ds:uri="c21afd64-1761-426e-bbcc-3f979c02d595"/>
+    <ds:schemaRef ds:uri="baf7add7-e9c6-4ff6-9212-8b6db818cbf7"/>
     <ds:schemaRef ds:uri="http://schemas.microsoft.com/office/2006/documentManagement/types"/>
     <ds:schemaRef ds:uri="http://schemas.microsoft.com/office/infopath/2007/PartnerControls"/>
     <ds:schemaRef ds:uri="http://schemas.openxmlformats.org/package/2006/metadata/core-properties"/>
@@ -6033,10 +5433,19 @@
 </ds:datastoreItem>
 </file>
 
-<file path=customXml/itemProps5.xml><?xml version="1.0" encoding="utf-8"?>
-<ds:datastoreItem xmlns:ds="http://schemas.openxmlformats.org/officeDocument/2006/customXml" ds:itemID="{3BF6FE77-DB13-4F8E-B262-35BDB1D68E81}">
+<file path=customXml/itemProps3.xml><?xml version="1.0" encoding="utf-8"?>
+<ds:datastoreItem xmlns:ds="http://schemas.openxmlformats.org/officeDocument/2006/customXml" ds:itemID="{9ABEDCF3-9ECC-4930-B573-01A6A0B99AF4}">
   <ds:schemaRefs>
-    <ds:schemaRef ds:uri="http://schemas.openxmlformats.org/officeDocument/2006/bibliography"/>
+    <ds:schemaRef ds:uri="http://schemas.microsoft.com/sharepoint/v3/contenttype/forms"/>
+  </ds:schemaRefs>
+</ds:datastoreItem>
+</file>
+
+<file path=customXml/itemProps4.xml><?xml version="1.0" encoding="utf-8"?>
+<ds:datastoreItem xmlns:ds="http://schemas.openxmlformats.org/officeDocument/2006/customXml" ds:itemID="{60ADE598-3079-4E2D-A7F9-CBBBAA8F5365}">
+  <ds:schemaRefs>
+    <ds:schemaRef ds:uri="http://schemas.microsoft.com/office/2006/metadata/properties"/>
+    <ds:schemaRef ds:uri="http://schemas.microsoft.com/office/infopath/2007/PartnerControls"/>
   </ds:schemaRefs>
 </ds:datastoreItem>
 </file>
</xml_diff>